<commit_message>
Python building doc updated
</commit_message>
<xml_diff>
--- a/docs/Python executable build process.docx
+++ b/docs/Python executable build process.docx
@@ -72,6 +72,11 @@
     </w:p>
     <w:p>
       <w:pPr>
+        <w:pStyle w:val="ListParagraph"/>
+        <w:numPr>
+          <w:ilvl w:val="0"/>
+          <w:numId w:val="2"/>
+        </w:numPr>
         <w:jc w:val="both"/>
         <w:rPr>
           <w:rFonts w:ascii="Times New Roman" w:hAnsi="Times New Roman" w:cs="Times New Roman"/>
@@ -92,21 +97,8 @@
       <w:pPr>
         <w:jc w:val="both"/>
         <w:rPr>
-          <w:rFonts w:ascii="Times New Roman" w:hAnsi="Times New Roman" w:cs="Times New Roman"/>
-          <w:sz w:val="24"/>
-          <w:szCs w:val="24"/>
-        </w:rPr>
-      </w:pPr>
-    </w:p>
-    <w:p>
-      <w:pPr>
-        <w:jc w:val="both"/>
-        <w:rPr>
-          <w:rFonts w:ascii="Times New Roman" w:hAnsi="Times New Roman" w:cs="Times New Roman"/>
           <w:b/>
           <w:bCs/>
-          <w:sz w:val="24"/>
-          <w:szCs w:val="24"/>
           <w:u w:val="single"/>
         </w:rPr>
       </w:pPr>
@@ -119,269 +111,270 @@
           <w:szCs w:val="24"/>
           <w:u w:val="single"/>
         </w:rPr>
-        <w:t>1. extract_images</w:t>
-      </w:r>
-    </w:p>
-    <w:p>
-      <w:pPr>
-        <w:jc w:val="both"/>
-        <w:rPr>
-          <w:rFonts w:ascii="Times New Roman" w:hAnsi="Times New Roman" w:cs="Times New Roman"/>
-          <w:sz w:val="24"/>
-          <w:szCs w:val="24"/>
-        </w:rPr>
-      </w:pPr>
-      <w:r>
-        <w:rPr>
-          <w:rFonts w:ascii="Times New Roman" w:hAnsi="Times New Roman" w:cs="Times New Roman"/>
-          <w:sz w:val="24"/>
-          <w:szCs w:val="24"/>
-        </w:rPr>
-        <w:t>Windows:</w:t>
-      </w:r>
-      <w:r>
-        <w:rPr>
-          <w:rFonts w:ascii="Times New Roman" w:hAnsi="Times New Roman" w:cs="Times New Roman"/>
-          <w:sz w:val="24"/>
-          <w:szCs w:val="24"/>
-        </w:rPr>
-        <w:br/>
-        <w:t xml:space="preserve">pyinstaller --onefile --name extract_images --hidden-import=fitz </w:t>
-      </w:r>
-      <w:r>
-        <w:rPr>
-          <w:rFonts w:ascii="Times New Roman" w:hAnsi="Times New Roman" w:cs="Times New Roman"/>
-          <w:sz w:val="24"/>
-          <w:szCs w:val="24"/>
-        </w:rPr>
-        <w:t>--hidden-import=PyMuPDF --hidden-import=PIL --hidden-import=PIL.Image --hidden-import=PIL.ImageDraw --hidden-import=PIL.ImageFont --collect-all fitz --collect-all PyMuPDF --collect-all PIL extract_images.py</w:t>
-      </w:r>
-    </w:p>
-    <w:p>
-      <w:pPr>
-        <w:jc w:val="both"/>
-        <w:rPr>
-          <w:rFonts w:ascii="Times New Roman" w:hAnsi="Times New Roman" w:cs="Times New Roman"/>
-          <w:sz w:val="24"/>
-          <w:szCs w:val="24"/>
-        </w:rPr>
-      </w:pPr>
-    </w:p>
-    <w:p>
-      <w:pPr>
-        <w:jc w:val="both"/>
-        <w:rPr>
-          <w:rFonts w:ascii="Times New Roman" w:hAnsi="Times New Roman" w:cs="Times New Roman"/>
-          <w:sz w:val="24"/>
-          <w:szCs w:val="24"/>
-        </w:rPr>
-      </w:pPr>
-      <w:r>
-        <w:rPr>
-          <w:rFonts w:ascii="Times New Roman" w:hAnsi="Times New Roman" w:cs="Times New Roman"/>
-          <w:sz w:val="24"/>
-          <w:szCs w:val="24"/>
-        </w:rPr>
-        <w:t>Linux:</w:t>
-      </w:r>
-    </w:p>
-    <w:p>
-      <w:pPr>
-        <w:jc w:val="both"/>
-        <w:rPr>
-          <w:rFonts w:ascii="Times New Roman" w:hAnsi="Times New Roman" w:cs="Times New Roman"/>
-          <w:sz w:val="24"/>
-          <w:szCs w:val="24"/>
-        </w:rPr>
-      </w:pPr>
-      <w:r>
-        <w:rPr>
-          <w:rFonts w:ascii="Times New Roman" w:hAnsi="Times New Roman" w:cs="Times New Roman"/>
-          <w:sz w:val="24"/>
-          <w:szCs w:val="24"/>
-        </w:rPr>
-        <w:t>pyinstaller --onefile --name extract_imag</w:t>
-      </w:r>
-      <w:r>
-        <w:rPr>
-          <w:rFonts w:ascii="Times New Roman" w:hAnsi="Times New Roman" w:cs="Times New Roman"/>
-          <w:sz w:val="24"/>
-          <w:szCs w:val="24"/>
-        </w:rPr>
-        <w:t>es --hidden-import=fitz --hidden-import=PyMuPDF --hidden-import=PIL --hidden-import=PIL.Image --hidden-import=PIL.ImageDraw --hidden-import=PIL.ImageFont --collect-all fitz --collect-all PyMuPDF --collect-all PIL extract_images.py</w:t>
-      </w:r>
-    </w:p>
-    <w:p>
-      <w:pPr>
-        <w:jc w:val="both"/>
-        <w:rPr>
-          <w:rFonts w:ascii="Times New Roman" w:hAnsi="Times New Roman" w:cs="Times New Roman"/>
-          <w:sz w:val="24"/>
-          <w:szCs w:val="24"/>
-        </w:rPr>
-      </w:pPr>
-      <w:r>
-        <w:rPr>
-          <w:rFonts w:ascii="Times New Roman" w:hAnsi="Times New Roman" w:cs="Times New Roman"/>
-          <w:sz w:val="24"/>
-          <w:szCs w:val="24"/>
-        </w:rPr>
-        <w:t>chmod +x dist/extract_ima</w:t>
-      </w:r>
-      <w:r>
-        <w:rPr>
-          <w:rFonts w:ascii="Times New Roman" w:hAnsi="Times New Roman" w:cs="Times New Roman"/>
-          <w:sz w:val="24"/>
-          <w:szCs w:val="24"/>
-        </w:rPr>
-        <w:t>ges</w:t>
-      </w:r>
-    </w:p>
-    <w:p>
-      <w:pPr>
-        <w:jc w:val="both"/>
-        <w:rPr>
-          <w:rFonts w:ascii="Times New Roman" w:hAnsi="Times New Roman" w:cs="Times New Roman"/>
-          <w:sz w:val="24"/>
-          <w:szCs w:val="24"/>
-        </w:rPr>
-      </w:pPr>
-    </w:p>
-    <w:p>
-      <w:pPr>
-        <w:jc w:val="both"/>
-        <w:rPr>
-          <w:rFonts w:ascii="Times New Roman" w:hAnsi="Times New Roman" w:cs="Times New Roman"/>
-          <w:sz w:val="24"/>
-          <w:szCs w:val="24"/>
-        </w:rPr>
-      </w:pPr>
-      <w:r>
-        <w:rPr>
-          <w:rFonts w:ascii="Times New Roman" w:hAnsi="Times New Roman" w:cs="Times New Roman"/>
-          <w:sz w:val="24"/>
-          <w:szCs w:val="24"/>
-        </w:rPr>
-        <w:t>macOS:</w:t>
-      </w:r>
-    </w:p>
-    <w:p>
-      <w:pPr>
-        <w:jc w:val="both"/>
-        <w:rPr>
-          <w:rFonts w:ascii="Times New Roman" w:hAnsi="Times New Roman" w:cs="Times New Roman"/>
-          <w:sz w:val="24"/>
-          <w:szCs w:val="24"/>
-        </w:rPr>
-      </w:pPr>
-      <w:r>
-        <w:rPr>
-          <w:rFonts w:ascii="Times New Roman" w:hAnsi="Times New Roman" w:cs="Times New Roman"/>
-          <w:sz w:val="24"/>
-          <w:szCs w:val="24"/>
-        </w:rPr>
-        <w:t>pyinstaller --onefile --name extract_images --hidden-import=fitz --hidden-import=PyMuPDF --hidden-import=PIL --hidden-import=PIL.Image --hidden-import=PIL.ImageDraw --hidden-import=PIL.ImageFont --collect-all fitz --collect-all PyMuPDF --collec</w:t>
-      </w:r>
-      <w:r>
-        <w:rPr>
-          <w:rFonts w:ascii="Times New Roman" w:hAnsi="Times New Roman" w:cs="Times New Roman"/>
-          <w:sz w:val="24"/>
-          <w:szCs w:val="24"/>
-        </w:rPr>
-        <w:t>t-all PIL extract_images.py</w:t>
-      </w:r>
-    </w:p>
-    <w:p>
-      <w:pPr>
-        <w:jc w:val="both"/>
-        <w:rPr>
-          <w:rFonts w:ascii="Times New Roman" w:hAnsi="Times New Roman" w:cs="Times New Roman"/>
-          <w:sz w:val="24"/>
-          <w:szCs w:val="24"/>
-        </w:rPr>
-      </w:pPr>
-      <w:r>
-        <w:rPr>
-          <w:rFonts w:ascii="Times New Roman" w:hAnsi="Times New Roman" w:cs="Times New Roman"/>
-          <w:sz w:val="24"/>
-          <w:szCs w:val="24"/>
-        </w:rPr>
-        <w:t>chmod +x dist/extract_images</w:t>
-      </w:r>
-    </w:p>
-    <w:p>
-      <w:pPr>
-        <w:jc w:val="both"/>
-        <w:rPr>
-          <w:rFonts w:ascii="Times New Roman" w:hAnsi="Times New Roman" w:cs="Times New Roman"/>
-          <w:sz w:val="24"/>
-          <w:szCs w:val="24"/>
-        </w:rPr>
-      </w:pPr>
-    </w:p>
-    <w:p>
-      <w:pPr>
-        <w:jc w:val="both"/>
-        <w:rPr>
-          <w:rFonts w:ascii="Times New Roman" w:hAnsi="Times New Roman" w:cs="Times New Roman"/>
-          <w:sz w:val="24"/>
-          <w:szCs w:val="24"/>
-        </w:rPr>
-      </w:pPr>
-    </w:p>
-    <w:p>
-      <w:pPr>
-        <w:jc w:val="both"/>
-        <w:rPr>
-          <w:rFonts w:ascii="Times New Roman" w:hAnsi="Times New Roman" w:cs="Times New Roman"/>
-          <w:sz w:val="24"/>
-          <w:szCs w:val="24"/>
-        </w:rPr>
-      </w:pPr>
-    </w:p>
-    <w:p>
-      <w:pPr>
-        <w:jc w:val="both"/>
-        <w:rPr>
-          <w:rFonts w:ascii="Times New Roman" w:hAnsi="Times New Roman" w:cs="Times New Roman"/>
-          <w:sz w:val="24"/>
-          <w:szCs w:val="24"/>
-        </w:rPr>
-      </w:pPr>
-    </w:p>
-    <w:p>
-      <w:pPr>
-        <w:jc w:val="both"/>
-        <w:rPr>
-          <w:rFonts w:ascii="Times New Roman" w:hAnsi="Times New Roman" w:cs="Times New Roman"/>
-          <w:sz w:val="24"/>
-          <w:szCs w:val="24"/>
-        </w:rPr>
-      </w:pPr>
-    </w:p>
-    <w:p>
-      <w:pPr>
-        <w:jc w:val="both"/>
-        <w:rPr>
-          <w:rFonts w:ascii="Times New Roman" w:hAnsi="Times New Roman" w:cs="Times New Roman"/>
-          <w:sz w:val="24"/>
-          <w:szCs w:val="24"/>
-        </w:rPr>
-      </w:pPr>
-    </w:p>
-    <w:p>
-      <w:pPr>
-        <w:jc w:val="both"/>
+        <w:t xml:space="preserve">You might also have to install the following package on Linux if you encounter error related to </w:t>
+      </w:r>
+      <w:r>
         <w:rPr>
           <w:rFonts w:ascii="Times New Roman" w:hAnsi="Times New Roman" w:cs="Times New Roman"/>
           <w:b/>
           <w:bCs/>
           <w:sz w:val="24"/>
           <w:szCs w:val="24"/>
+          <w:highlight w:val="yellow"/>
           <w:u w:val="single"/>
         </w:rPr>
-      </w:pPr>
-      <w:r>
+        <w:t>binutils</w:t>
+      </w:r>
+    </w:p>
+    <w:p>
+      <w:pPr>
+        <w:pStyle w:val="ListParagraph"/>
+        <w:numPr>
+          <w:ilvl w:val="0"/>
+          <w:numId w:val="1"/>
+        </w:numPr>
+        <w:jc w:val="both"/>
+        <w:rPr>
+          <w:rFonts w:ascii="Times New Roman" w:hAnsi="Times New Roman" w:cs="Times New Roman"/>
+          <w:sz w:val="24"/>
+          <w:szCs w:val="24"/>
+        </w:rPr>
+      </w:pPr>
+      <w:r>
+        <w:rPr>
+          <w:rFonts w:ascii="Times New Roman" w:hAnsi="Times New Roman" w:cs="Times New Roman"/>
+          <w:sz w:val="24"/>
+          <w:szCs w:val="24"/>
+        </w:rPr>
+        <w:t>sudo apt update</w:t>
+      </w:r>
+    </w:p>
+    <w:p>
+      <w:pPr>
+        <w:pStyle w:val="ListParagraph"/>
+        <w:numPr>
+          <w:ilvl w:val="0"/>
+          <w:numId w:val="1"/>
+        </w:numPr>
+        <w:jc w:val="both"/>
+        <w:rPr>
+          <w:rFonts w:ascii="Times New Roman" w:hAnsi="Times New Roman" w:cs="Times New Roman"/>
+          <w:sz w:val="24"/>
+          <w:szCs w:val="24"/>
+        </w:rPr>
+      </w:pPr>
+      <w:r>
+        <w:rPr>
+          <w:rFonts w:ascii="Times New Roman" w:hAnsi="Times New Roman" w:cs="Times New Roman"/>
+          <w:sz w:val="24"/>
+          <w:szCs w:val="24"/>
+        </w:rPr>
+        <w:t>sudo apt install binutils</w:t>
+      </w:r>
+    </w:p>
+    <w:p>
+      <w:pPr>
+        <w:jc w:val="both"/>
+        <w:rPr>
+          <w:rFonts w:ascii="Times New Roman" w:hAnsi="Times New Roman" w:cs="Times New Roman"/>
+          <w:sz w:val="24"/>
+          <w:szCs w:val="24"/>
+        </w:rPr>
+      </w:pPr>
+    </w:p>
+    <w:p>
+      <w:pPr>
+        <w:jc w:val="both"/>
+        <w:rPr>
+          <w:rFonts w:ascii="Times New Roman" w:hAnsi="Times New Roman" w:cs="Times New Roman"/>
+          <w:sz w:val="24"/>
+          <w:szCs w:val="24"/>
+        </w:rPr>
+      </w:pPr>
+    </w:p>
+    <w:p>
+      <w:pPr>
+        <w:jc w:val="both"/>
+        <w:rPr>
+          <w:rFonts w:ascii="Times New Roman" w:hAnsi="Times New Roman" w:cs="Times New Roman"/>
+          <w:sz w:val="24"/>
+          <w:szCs w:val="24"/>
+        </w:rPr>
+      </w:pPr>
+    </w:p>
+    <w:p>
+      <w:pPr>
+        <w:jc w:val="both"/>
+        <w:rPr>
+          <w:rFonts w:ascii="Times New Roman" w:hAnsi="Times New Roman" w:cs="Times New Roman"/>
+          <w:sz w:val="24"/>
+          <w:szCs w:val="24"/>
+        </w:rPr>
+      </w:pPr>
+    </w:p>
+    <w:p>
+      <w:pPr>
+        <w:jc w:val="both"/>
+        <w:rPr>
+          <w:rFonts w:ascii="Times New Roman" w:hAnsi="Times New Roman" w:cs="Times New Roman"/>
+          <w:sz w:val="24"/>
+          <w:szCs w:val="24"/>
+        </w:rPr>
+      </w:pPr>
+    </w:p>
+    <w:p>
+      <w:pPr>
+        <w:jc w:val="both"/>
+        <w:rPr>
+          <w:rFonts w:ascii="Times New Roman" w:hAnsi="Times New Roman" w:cs="Times New Roman"/>
+          <w:sz w:val="24"/>
+          <w:szCs w:val="24"/>
+        </w:rPr>
+      </w:pPr>
+    </w:p>
+    <w:p>
+      <w:pPr>
+        <w:jc w:val="both"/>
+        <w:rPr>
+          <w:rFonts w:ascii="Times New Roman" w:hAnsi="Times New Roman" w:cs="Times New Roman"/>
+          <w:sz w:val="24"/>
+          <w:szCs w:val="24"/>
+        </w:rPr>
+      </w:pPr>
+    </w:p>
+    <w:p>
+      <w:pPr>
+        <w:jc w:val="both"/>
+        <w:rPr>
+          <w:rFonts w:ascii="Times New Roman" w:hAnsi="Times New Roman" w:cs="Times New Roman"/>
+          <w:sz w:val="24"/>
+          <w:szCs w:val="24"/>
+        </w:rPr>
+      </w:pPr>
+    </w:p>
+    <w:p>
+      <w:pPr>
+        <w:jc w:val="both"/>
+        <w:rPr>
+          <w:rFonts w:ascii="Times New Roman" w:hAnsi="Times New Roman" w:cs="Times New Roman"/>
+          <w:sz w:val="24"/>
+          <w:szCs w:val="24"/>
+        </w:rPr>
+      </w:pPr>
+    </w:p>
+    <w:p>
+      <w:pPr>
+        <w:jc w:val="both"/>
+        <w:rPr>
+          <w:rFonts w:ascii="Times New Roman" w:hAnsi="Times New Roman" w:cs="Times New Roman"/>
+          <w:sz w:val="24"/>
+          <w:szCs w:val="24"/>
+        </w:rPr>
+      </w:pPr>
+    </w:p>
+    <w:p>
+      <w:pPr>
+        <w:jc w:val="both"/>
+        <w:rPr>
+          <w:rFonts w:ascii="Times New Roman" w:hAnsi="Times New Roman" w:cs="Times New Roman"/>
+          <w:sz w:val="24"/>
+          <w:szCs w:val="24"/>
+        </w:rPr>
+      </w:pPr>
+    </w:p>
+    <w:p>
+      <w:pPr>
+        <w:jc w:val="both"/>
+        <w:rPr>
+          <w:rFonts w:ascii="Times New Roman" w:hAnsi="Times New Roman" w:cs="Times New Roman"/>
+          <w:sz w:val="24"/>
+          <w:szCs w:val="24"/>
+        </w:rPr>
+      </w:pPr>
+    </w:p>
+    <w:p>
+      <w:pPr>
+        <w:jc w:val="both"/>
+        <w:rPr>
+          <w:rFonts w:ascii="Times New Roman" w:hAnsi="Times New Roman" w:cs="Times New Roman"/>
+          <w:sz w:val="24"/>
+          <w:szCs w:val="24"/>
+        </w:rPr>
+      </w:pPr>
+    </w:p>
+    <w:p>
+      <w:pPr>
+        <w:jc w:val="both"/>
+        <w:rPr>
+          <w:rFonts w:ascii="Times New Roman" w:hAnsi="Times New Roman" w:cs="Times New Roman"/>
+          <w:sz w:val="24"/>
+          <w:szCs w:val="24"/>
+        </w:rPr>
+      </w:pPr>
+    </w:p>
+    <w:p>
+      <w:pPr>
+        <w:jc w:val="both"/>
+        <w:rPr>
+          <w:rFonts w:ascii="Times New Roman" w:hAnsi="Times New Roman" w:cs="Times New Roman"/>
+          <w:sz w:val="24"/>
+          <w:szCs w:val="24"/>
+        </w:rPr>
+      </w:pPr>
+    </w:p>
+    <w:p>
+      <w:pPr>
+        <w:jc w:val="both"/>
+        <w:rPr>
+          <w:rFonts w:ascii="Times New Roman" w:hAnsi="Times New Roman" w:cs="Times New Roman"/>
+          <w:sz w:val="24"/>
+          <w:szCs w:val="24"/>
+        </w:rPr>
+      </w:pPr>
+    </w:p>
+    <w:p>
+      <w:pPr>
+        <w:jc w:val="both"/>
+        <w:rPr>
+          <w:rFonts w:ascii="Times New Roman" w:hAnsi="Times New Roman" w:cs="Times New Roman"/>
+          <w:sz w:val="24"/>
+          <w:szCs w:val="24"/>
+        </w:rPr>
+      </w:pPr>
+    </w:p>
+    <w:p>
+      <w:pPr>
+        <w:jc w:val="both"/>
+        <w:rPr>
+          <w:rFonts w:ascii="Times New Roman" w:hAnsi="Times New Roman" w:cs="Times New Roman"/>
+          <w:sz w:val="24"/>
+          <w:szCs w:val="24"/>
+        </w:rPr>
+      </w:pPr>
+    </w:p>
+    <w:p>
+      <w:pPr>
+        <w:jc w:val="both"/>
+        <w:rPr>
+          <w:rFonts w:ascii="Times New Roman" w:hAnsi="Times New Roman" w:cs="Times New Roman"/>
+          <w:sz w:val="24"/>
+          <w:szCs w:val="24"/>
+        </w:rPr>
+      </w:pPr>
+    </w:p>
+    <w:p>
+      <w:pPr>
+        <w:jc w:val="both"/>
+        <w:rPr>
+          <w:rFonts w:ascii="Times New Roman" w:hAnsi="Times New Roman" w:cs="Times New Roman"/>
+          <w:sz w:val="24"/>
+          <w:szCs w:val="24"/>
+        </w:rPr>
+      </w:pPr>
+    </w:p>
+    <w:p>
+      <w:pPr>
+        <w:jc w:val="both"/>
         <w:rPr>
           <w:rFonts w:ascii="Times New Roman" w:hAnsi="Times New Roman" w:cs="Times New Roman"/>
           <w:b/>
@@ -390,6 +383,334 @@
           <w:szCs w:val="24"/>
           <w:u w:val="single"/>
         </w:rPr>
+      </w:pPr>
+      <w:r>
+        <w:rPr>
+          <w:rFonts w:ascii="Times New Roman" w:hAnsi="Times New Roman" w:cs="Times New Roman"/>
+          <w:b/>
+          <w:bCs/>
+          <w:sz w:val="24"/>
+          <w:szCs w:val="24"/>
+          <w:u w:val="single"/>
+        </w:rPr>
+        <w:lastRenderedPageBreak/>
+        <w:t>1. extract_images</w:t>
+      </w:r>
+    </w:p>
+    <w:p>
+      <w:pPr>
+        <w:jc w:val="both"/>
+        <w:rPr>
+          <w:rFonts w:ascii="Times New Roman" w:hAnsi="Times New Roman" w:cs="Times New Roman"/>
+          <w:sz w:val="24"/>
+          <w:szCs w:val="24"/>
+        </w:rPr>
+      </w:pPr>
+      <w:r>
+        <w:rPr>
+          <w:rFonts w:ascii="Times New Roman" w:hAnsi="Times New Roman" w:cs="Times New Roman"/>
+          <w:sz w:val="24"/>
+          <w:szCs w:val="24"/>
+        </w:rPr>
+        <w:t>Windows:</w:t>
+      </w:r>
+      <w:r>
+        <w:rPr>
+          <w:rFonts w:ascii="Times New Roman" w:hAnsi="Times New Roman" w:cs="Times New Roman"/>
+          <w:sz w:val="24"/>
+          <w:szCs w:val="24"/>
+        </w:rPr>
+        <w:br/>
+        <w:t>pyinstaller --onefile --name extract_images --hidden-import=fitz --hidden-import=PyMuPDF --hidden-import=PIL --hidden-import=PIL.Image --hidden-import=PIL.ImageDraw --hidden-import=PIL.ImageFont --collect-all fitz --collect-all PyMuPDF --collect-all PIL extract_images.py</w:t>
+      </w:r>
+    </w:p>
+    <w:p>
+      <w:pPr>
+        <w:jc w:val="both"/>
+        <w:rPr>
+          <w:rFonts w:ascii="Times New Roman" w:hAnsi="Times New Roman" w:cs="Times New Roman"/>
+          <w:sz w:val="24"/>
+          <w:szCs w:val="24"/>
+        </w:rPr>
+      </w:pPr>
+    </w:p>
+    <w:p>
+      <w:pPr>
+        <w:jc w:val="both"/>
+        <w:rPr>
+          <w:rFonts w:ascii="Times New Roman" w:hAnsi="Times New Roman" w:cs="Times New Roman"/>
+          <w:sz w:val="24"/>
+          <w:szCs w:val="24"/>
+        </w:rPr>
+      </w:pPr>
+      <w:r>
+        <w:rPr>
+          <w:rFonts w:ascii="Times New Roman" w:hAnsi="Times New Roman" w:cs="Times New Roman"/>
+          <w:sz w:val="24"/>
+          <w:szCs w:val="24"/>
+        </w:rPr>
+        <w:t>Linux:</w:t>
+      </w:r>
+    </w:p>
+    <w:p>
+      <w:pPr>
+        <w:jc w:val="both"/>
+        <w:rPr>
+          <w:rFonts w:ascii="Times New Roman" w:hAnsi="Times New Roman" w:cs="Times New Roman"/>
+          <w:sz w:val="24"/>
+          <w:szCs w:val="24"/>
+        </w:rPr>
+      </w:pPr>
+      <w:r>
+        <w:rPr>
+          <w:rFonts w:ascii="Times New Roman" w:hAnsi="Times New Roman" w:cs="Times New Roman"/>
+          <w:sz w:val="24"/>
+          <w:szCs w:val="24"/>
+        </w:rPr>
+        <w:t>pyinstaller --onefile --name extract_images --hidden-import=fitz --hidden-import=PyMuPDF --hidden-import=PIL --hidden-import=PIL.Image --hidden-import=PIL.ImageDraw --hidden-import=PIL.ImageFont --collect-all fitz --collect-all PyMuPDF --collect-all PIL extract_images.py</w:t>
+      </w:r>
+    </w:p>
+    <w:p>
+      <w:pPr>
+        <w:jc w:val="both"/>
+        <w:rPr>
+          <w:rFonts w:ascii="Times New Roman" w:hAnsi="Times New Roman" w:cs="Times New Roman"/>
+          <w:sz w:val="24"/>
+          <w:szCs w:val="24"/>
+        </w:rPr>
+      </w:pPr>
+      <w:r>
+        <w:rPr>
+          <w:rFonts w:ascii="Times New Roman" w:hAnsi="Times New Roman" w:cs="Times New Roman"/>
+          <w:sz w:val="24"/>
+          <w:szCs w:val="24"/>
+        </w:rPr>
+        <w:t>chmod +x dist/extract_images</w:t>
+      </w:r>
+    </w:p>
+    <w:p>
+      <w:pPr>
+        <w:jc w:val="both"/>
+        <w:rPr>
+          <w:rFonts w:ascii="Times New Roman" w:hAnsi="Times New Roman" w:cs="Times New Roman"/>
+          <w:sz w:val="24"/>
+          <w:szCs w:val="24"/>
+        </w:rPr>
+      </w:pPr>
+    </w:p>
+    <w:p>
+      <w:pPr>
+        <w:jc w:val="both"/>
+        <w:rPr>
+          <w:rFonts w:ascii="Times New Roman" w:hAnsi="Times New Roman" w:cs="Times New Roman"/>
+          <w:sz w:val="24"/>
+          <w:szCs w:val="24"/>
+        </w:rPr>
+      </w:pPr>
+      <w:r>
+        <w:rPr>
+          <w:rFonts w:ascii="Times New Roman" w:hAnsi="Times New Roman" w:cs="Times New Roman"/>
+          <w:sz w:val="24"/>
+          <w:szCs w:val="24"/>
+        </w:rPr>
+        <w:t>macOS:</w:t>
+      </w:r>
+    </w:p>
+    <w:p>
+      <w:pPr>
+        <w:jc w:val="both"/>
+        <w:rPr>
+          <w:rFonts w:ascii="Times New Roman" w:hAnsi="Times New Roman" w:cs="Times New Roman"/>
+          <w:sz w:val="24"/>
+          <w:szCs w:val="24"/>
+        </w:rPr>
+      </w:pPr>
+      <w:r>
+        <w:rPr>
+          <w:rFonts w:ascii="Times New Roman" w:hAnsi="Times New Roman" w:cs="Times New Roman"/>
+          <w:sz w:val="24"/>
+          <w:szCs w:val="24"/>
+        </w:rPr>
+        <w:t>pyinstaller --onefile --name extract_images --hidden-import=fitz --hidden-import=PyMuPDF --hidden-import=PIL --hidden-import=PIL.Image --hidden-import=PIL.ImageDraw --hidden-import=PIL.ImageFont --collect-all fitz --collect-all PyMuPDF --collect-all PIL extract_images.py</w:t>
+      </w:r>
+    </w:p>
+    <w:p>
+      <w:pPr>
+        <w:jc w:val="both"/>
+        <w:rPr>
+          <w:rFonts w:ascii="Times New Roman" w:hAnsi="Times New Roman" w:cs="Times New Roman"/>
+          <w:sz w:val="24"/>
+          <w:szCs w:val="24"/>
+        </w:rPr>
+      </w:pPr>
+      <w:r>
+        <w:rPr>
+          <w:rFonts w:ascii="Times New Roman" w:hAnsi="Times New Roman" w:cs="Times New Roman"/>
+          <w:sz w:val="24"/>
+          <w:szCs w:val="24"/>
+        </w:rPr>
+        <w:t>chmod +x dist/extract_images</w:t>
+      </w:r>
+    </w:p>
+    <w:p>
+      <w:pPr>
+        <w:jc w:val="both"/>
+        <w:rPr>
+          <w:rFonts w:ascii="Times New Roman" w:hAnsi="Times New Roman" w:cs="Times New Roman"/>
+          <w:sz w:val="24"/>
+          <w:szCs w:val="24"/>
+        </w:rPr>
+      </w:pPr>
+    </w:p>
+    <w:p>
+      <w:pPr>
+        <w:jc w:val="both"/>
+        <w:rPr>
+          <w:rFonts w:ascii="Times New Roman" w:hAnsi="Times New Roman" w:cs="Times New Roman"/>
+          <w:sz w:val="24"/>
+          <w:szCs w:val="24"/>
+        </w:rPr>
+      </w:pPr>
+    </w:p>
+    <w:p>
+      <w:pPr>
+        <w:jc w:val="both"/>
+        <w:rPr>
+          <w:rFonts w:ascii="Times New Roman" w:hAnsi="Times New Roman" w:cs="Times New Roman"/>
+          <w:sz w:val="24"/>
+          <w:szCs w:val="24"/>
+        </w:rPr>
+      </w:pPr>
+    </w:p>
+    <w:p>
+      <w:pPr>
+        <w:jc w:val="both"/>
+        <w:rPr>
+          <w:rFonts w:ascii="Times New Roman" w:hAnsi="Times New Roman" w:cs="Times New Roman"/>
+          <w:sz w:val="24"/>
+          <w:szCs w:val="24"/>
+        </w:rPr>
+      </w:pPr>
+    </w:p>
+    <w:p>
+      <w:pPr>
+        <w:jc w:val="both"/>
+        <w:rPr>
+          <w:rFonts w:ascii="Times New Roman" w:hAnsi="Times New Roman" w:cs="Times New Roman"/>
+          <w:sz w:val="24"/>
+          <w:szCs w:val="24"/>
+        </w:rPr>
+      </w:pPr>
+    </w:p>
+    <w:p>
+      <w:pPr>
+        <w:jc w:val="both"/>
+        <w:rPr>
+          <w:rFonts w:ascii="Times New Roman" w:hAnsi="Times New Roman" w:cs="Times New Roman"/>
+          <w:sz w:val="24"/>
+          <w:szCs w:val="24"/>
+        </w:rPr>
+      </w:pPr>
+    </w:p>
+    <w:p>
+      <w:pPr>
+        <w:jc w:val="both"/>
+        <w:rPr>
+          <w:rFonts w:ascii="Times New Roman" w:hAnsi="Times New Roman" w:cs="Times New Roman"/>
+          <w:b/>
+          <w:bCs/>
+          <w:sz w:val="24"/>
+          <w:szCs w:val="24"/>
+          <w:u w:val="single"/>
+        </w:rPr>
+      </w:pPr>
+    </w:p>
+    <w:p>
+      <w:pPr>
+        <w:jc w:val="both"/>
+        <w:rPr>
+          <w:rFonts w:ascii="Times New Roman" w:hAnsi="Times New Roman" w:cs="Times New Roman"/>
+          <w:b/>
+          <w:bCs/>
+          <w:sz w:val="24"/>
+          <w:szCs w:val="24"/>
+          <w:u w:val="single"/>
+        </w:rPr>
+      </w:pPr>
+    </w:p>
+    <w:p>
+      <w:pPr>
+        <w:jc w:val="both"/>
+        <w:rPr>
+          <w:rFonts w:ascii="Times New Roman" w:hAnsi="Times New Roman" w:cs="Times New Roman"/>
+          <w:b/>
+          <w:bCs/>
+          <w:sz w:val="24"/>
+          <w:szCs w:val="24"/>
+          <w:u w:val="single"/>
+        </w:rPr>
+      </w:pPr>
+    </w:p>
+    <w:p>
+      <w:pPr>
+        <w:jc w:val="both"/>
+        <w:rPr>
+          <w:rFonts w:ascii="Times New Roman" w:hAnsi="Times New Roman" w:cs="Times New Roman"/>
+          <w:b/>
+          <w:bCs/>
+          <w:sz w:val="24"/>
+          <w:szCs w:val="24"/>
+          <w:u w:val="single"/>
+        </w:rPr>
+      </w:pPr>
+    </w:p>
+    <w:p>
+      <w:pPr>
+        <w:jc w:val="both"/>
+        <w:rPr>
+          <w:rFonts w:ascii="Times New Roman" w:hAnsi="Times New Roman" w:cs="Times New Roman"/>
+          <w:b/>
+          <w:bCs/>
+          <w:sz w:val="24"/>
+          <w:szCs w:val="24"/>
+          <w:u w:val="single"/>
+        </w:rPr>
+      </w:pPr>
+    </w:p>
+    <w:p>
+      <w:pPr>
+        <w:jc w:val="both"/>
+        <w:rPr>
+          <w:rFonts w:ascii="Times New Roman" w:hAnsi="Times New Roman" w:cs="Times New Roman"/>
+          <w:b/>
+          <w:bCs/>
+          <w:sz w:val="24"/>
+          <w:szCs w:val="24"/>
+          <w:u w:val="single"/>
+        </w:rPr>
+      </w:pPr>
+    </w:p>
+    <w:p>
+      <w:pPr>
+        <w:jc w:val="both"/>
+        <w:rPr>
+          <w:rFonts w:ascii="Times New Roman" w:hAnsi="Times New Roman" w:cs="Times New Roman"/>
+          <w:b/>
+          <w:bCs/>
+          <w:sz w:val="24"/>
+          <w:szCs w:val="24"/>
+          <w:u w:val="single"/>
+        </w:rPr>
+      </w:pPr>
+      <w:r>
+        <w:rPr>
+          <w:rFonts w:ascii="Times New Roman" w:hAnsi="Times New Roman" w:cs="Times New Roman"/>
+          <w:b/>
+          <w:bCs/>
+          <w:sz w:val="24"/>
+          <w:szCs w:val="24"/>
+          <w:u w:val="single"/>
+        </w:rPr>
         <w:lastRenderedPageBreak/>
         <w:t>2. add_watermark</w:t>
       </w:r>
@@ -427,15 +748,7 @@
           <w:sz w:val="24"/>
           <w:szCs w:val="24"/>
         </w:rPr>
-        <w:t>pyinstaller --onefile --name add_watermark --hidden-import=fitz --hidden-import=PyMuPDF --hidden-import=PIL --hidden-import=PIL.Image --hidden-import=PIL.ImageDraw --h</w:t>
-      </w:r>
-      <w:r>
-        <w:rPr>
-          <w:rFonts w:ascii="Times New Roman" w:hAnsi="Times New Roman" w:cs="Times New Roman"/>
-          <w:sz w:val="24"/>
-          <w:szCs w:val="24"/>
-        </w:rPr>
-        <w:t>idden-import=PIL.ImageFont --collect-all fitz --collect-all PyMuPDF --collect-all PIL add_watermark.py</w:t>
+        <w:t>pyinstaller --onefile --name add_watermark --hidden-import=fitz --hidden-import=PyMuPDF --hidden-import=PIL --hidden-import=PIL.Image --hidden-import=PIL.ImageDraw --hidden-import=PIL.ImageFont --collect-all fitz --collect-all PyMuPDF --collect-all PIL add_watermark.py</w:t>
       </w:r>
     </w:p>
     <w:p>
@@ -481,15 +794,7 @@
           <w:sz w:val="24"/>
           <w:szCs w:val="24"/>
         </w:rPr>
-        <w:t>pyinstaller --onefile --name add_watermark --hidden-import=fitz --hidden-import=PyMuPDF --hidden-import=PIL --hidden-import=PIL.Image --hidden-im</w:t>
-      </w:r>
-      <w:r>
-        <w:rPr>
-          <w:rFonts w:ascii="Times New Roman" w:hAnsi="Times New Roman" w:cs="Times New Roman"/>
-          <w:sz w:val="24"/>
-          <w:szCs w:val="24"/>
-        </w:rPr>
-        <w:t>port=PIL.ImageDraw --hidden-import=PIL.ImageFont --collect-all fitz --collect-all PyMuPDF --collect-all PIL add_watermark.py</w:t>
+        <w:t>pyinstaller --onefile --name add_watermark --hidden-import=fitz --hidden-import=PyMuPDF --hidden-import=PIL --hidden-import=PIL.Image --hidden-import=PIL.ImageDraw --hidden-import=PIL.ImageFont --collect-all fitz --collect-all PyMuPDF --collect-all PIL add_watermark.py</w:t>
       </w:r>
     </w:p>
     <w:p>
@@ -544,15 +849,7 @@
           <w:szCs w:val="24"/>
         </w:rPr>
         <w:br/>
-        <w:t xml:space="preserve">pyinstaller --onefile --name add_watermark --hidden-import=fitz </w:t>
-      </w:r>
-      <w:r>
-        <w:rPr>
-          <w:rFonts w:ascii="Times New Roman" w:hAnsi="Times New Roman" w:cs="Times New Roman"/>
-          <w:sz w:val="24"/>
-          <w:szCs w:val="24"/>
-        </w:rPr>
-        <w:t>--hidden-import=PyMuPDF --hidden-import=PIL --hidden-import=PIL.Image --hidden-import=PIL.ImageDraw --hidden-import=PIL.ImageFont --collect-all fitz --collect-all PyMuPDF --collect-all PIL add_watermark.py</w:t>
+        <w:t>pyinstaller --onefile --name add_watermark --hidden-import=fitz --hidden-import=PyMuPDF --hidden-import=PIL --hidden-import=PIL.Image --hidden-import=PIL.ImageDraw --hidden-import=PIL.ImageFont --collect-all fitz --collect-all PyMuPDF --collect-all PIL add_watermark.py</w:t>
       </w:r>
     </w:p>
     <w:p>
@@ -715,9 +1012,289 @@
           <w:u w:val="single"/>
         </w:rPr>
         <w:lastRenderedPageBreak/>
-        <w:t>3</w:t>
-      </w:r>
-      <w:r>
+        <w:t>3. convert_pdf_images</w:t>
+      </w:r>
+    </w:p>
+    <w:p>
+      <w:pPr>
+        <w:jc w:val="both"/>
+        <w:rPr>
+          <w:rFonts w:ascii="Times New Roman" w:hAnsi="Times New Roman" w:cs="Times New Roman"/>
+          <w:sz w:val="24"/>
+          <w:szCs w:val="24"/>
+        </w:rPr>
+      </w:pPr>
+      <w:r>
+        <w:rPr>
+          <w:rFonts w:ascii="Times New Roman" w:hAnsi="Times New Roman" w:cs="Times New Roman"/>
+          <w:sz w:val="24"/>
+          <w:szCs w:val="24"/>
+        </w:rPr>
+        <w:t>Windows:</w:t>
+      </w:r>
+      <w:r>
+        <w:rPr>
+          <w:rFonts w:ascii="Times New Roman" w:hAnsi="Times New Roman" w:cs="Times New Roman"/>
+          <w:sz w:val="24"/>
+          <w:szCs w:val="24"/>
+        </w:rPr>
+        <w:br/>
+        <w:t>pyinstaller --onefile --name convert_pdf_images --hidden-import=fitz --hidden-import=PyMuPDF --hidden-import=PIL --hidden-import=PIL.Image --collect-all fitz --collect-all PyMuPDF --collect-all PIL convert_pdf_images.py</w:t>
+      </w:r>
+    </w:p>
+    <w:p>
+      <w:pPr>
+        <w:jc w:val="both"/>
+        <w:rPr>
+          <w:rFonts w:ascii="Times New Roman" w:hAnsi="Times New Roman" w:cs="Times New Roman"/>
+          <w:sz w:val="24"/>
+          <w:szCs w:val="24"/>
+        </w:rPr>
+      </w:pPr>
+    </w:p>
+    <w:p>
+      <w:pPr>
+        <w:jc w:val="both"/>
+        <w:rPr>
+          <w:rFonts w:ascii="Times New Roman" w:hAnsi="Times New Roman" w:cs="Times New Roman"/>
+          <w:sz w:val="24"/>
+          <w:szCs w:val="24"/>
+        </w:rPr>
+      </w:pPr>
+      <w:r>
+        <w:rPr>
+          <w:rFonts w:ascii="Times New Roman" w:hAnsi="Times New Roman" w:cs="Times New Roman"/>
+          <w:sz w:val="24"/>
+          <w:szCs w:val="24"/>
+        </w:rPr>
+        <w:t>Linux:</w:t>
+      </w:r>
+      <w:r>
+        <w:rPr>
+          <w:rFonts w:ascii="Times New Roman" w:hAnsi="Times New Roman" w:cs="Times New Roman"/>
+          <w:sz w:val="24"/>
+          <w:szCs w:val="24"/>
+        </w:rPr>
+        <w:br/>
+        <w:t>pyinstaller --onefile --name convert_pdf_images --hidden-import=fitz --hidden-import=PyMuPDF --hidden-import=PIL --hidden-import=PIL.Image --collect-all fitz --collect-all PyMuPDF --collect-all PIL convert_pdf_images.py</w:t>
+      </w:r>
+    </w:p>
+    <w:p>
+      <w:pPr>
+        <w:jc w:val="both"/>
+        <w:rPr>
+          <w:rFonts w:ascii="Times New Roman" w:hAnsi="Times New Roman" w:cs="Times New Roman"/>
+          <w:sz w:val="24"/>
+          <w:szCs w:val="24"/>
+        </w:rPr>
+      </w:pPr>
+      <w:r>
+        <w:rPr>
+          <w:rFonts w:ascii="Times New Roman" w:hAnsi="Times New Roman" w:cs="Times New Roman"/>
+          <w:sz w:val="24"/>
+          <w:szCs w:val="24"/>
+        </w:rPr>
+        <w:t>chmod +x dist/convert_pdf_images</w:t>
+      </w:r>
+    </w:p>
+    <w:p>
+      <w:pPr>
+        <w:jc w:val="both"/>
+        <w:rPr>
+          <w:rFonts w:ascii="Times New Roman" w:hAnsi="Times New Roman" w:cs="Times New Roman"/>
+          <w:sz w:val="24"/>
+          <w:szCs w:val="24"/>
+        </w:rPr>
+      </w:pPr>
+    </w:p>
+    <w:p>
+      <w:pPr>
+        <w:jc w:val="both"/>
+        <w:rPr>
+          <w:rFonts w:ascii="Times New Roman" w:hAnsi="Times New Roman" w:cs="Times New Roman"/>
+          <w:sz w:val="24"/>
+          <w:szCs w:val="24"/>
+        </w:rPr>
+      </w:pPr>
+      <w:r>
+        <w:rPr>
+          <w:rFonts w:ascii="Times New Roman" w:hAnsi="Times New Roman" w:cs="Times New Roman"/>
+          <w:sz w:val="24"/>
+          <w:szCs w:val="24"/>
+        </w:rPr>
+        <w:t>macOS:</w:t>
+      </w:r>
+      <w:r>
+        <w:rPr>
+          <w:rFonts w:ascii="Times New Roman" w:hAnsi="Times New Roman" w:cs="Times New Roman"/>
+          <w:sz w:val="24"/>
+          <w:szCs w:val="24"/>
+        </w:rPr>
+        <w:br/>
+        <w:t>pyinstaller --onefile --name convert_pdf_images --hidden-import=fitz --hidden-import=PyMuPDF --hidden-import=PIL --hidden-import=PIL.Image --collect-all fitz --collect-all PyMuPDF --collect-all PIL convert_pdf_images.py</w:t>
+      </w:r>
+    </w:p>
+    <w:p>
+      <w:pPr>
+        <w:jc w:val="both"/>
+        <w:rPr>
+          <w:rFonts w:ascii="Times New Roman" w:hAnsi="Times New Roman" w:cs="Times New Roman"/>
+          <w:sz w:val="24"/>
+          <w:szCs w:val="24"/>
+        </w:rPr>
+      </w:pPr>
+      <w:r>
+        <w:rPr>
+          <w:rFonts w:ascii="Times New Roman" w:hAnsi="Times New Roman" w:cs="Times New Roman"/>
+          <w:sz w:val="24"/>
+          <w:szCs w:val="24"/>
+        </w:rPr>
+        <w:t>chmod +x dist/convert_pdf_images</w:t>
+      </w:r>
+    </w:p>
+    <w:p>
+      <w:pPr>
+        <w:jc w:val="both"/>
+        <w:rPr>
+          <w:rFonts w:ascii="Times New Roman" w:hAnsi="Times New Roman" w:cs="Times New Roman"/>
+          <w:sz w:val="24"/>
+          <w:szCs w:val="24"/>
+        </w:rPr>
+      </w:pPr>
+    </w:p>
+    <w:p>
+      <w:pPr>
+        <w:jc w:val="both"/>
+        <w:rPr>
+          <w:rFonts w:ascii="Times New Roman" w:hAnsi="Times New Roman" w:cs="Times New Roman"/>
+          <w:sz w:val="24"/>
+          <w:szCs w:val="24"/>
+        </w:rPr>
+      </w:pPr>
+    </w:p>
+    <w:p>
+      <w:pPr>
+        <w:jc w:val="both"/>
+        <w:rPr>
+          <w:rFonts w:ascii="Times New Roman" w:hAnsi="Times New Roman" w:cs="Times New Roman"/>
+          <w:sz w:val="24"/>
+          <w:szCs w:val="24"/>
+        </w:rPr>
+      </w:pPr>
+    </w:p>
+    <w:p>
+      <w:pPr>
+        <w:jc w:val="both"/>
+        <w:rPr>
+          <w:rFonts w:ascii="Times New Roman" w:hAnsi="Times New Roman" w:cs="Times New Roman"/>
+          <w:sz w:val="24"/>
+          <w:szCs w:val="24"/>
+        </w:rPr>
+      </w:pPr>
+    </w:p>
+    <w:p>
+      <w:pPr>
+        <w:jc w:val="both"/>
+        <w:rPr>
+          <w:rFonts w:ascii="Times New Roman" w:hAnsi="Times New Roman" w:cs="Times New Roman"/>
+          <w:sz w:val="24"/>
+          <w:szCs w:val="24"/>
+        </w:rPr>
+      </w:pPr>
+    </w:p>
+    <w:p>
+      <w:pPr>
+        <w:jc w:val="both"/>
+        <w:rPr>
+          <w:rFonts w:ascii="Times New Roman" w:hAnsi="Times New Roman" w:cs="Times New Roman"/>
+          <w:sz w:val="24"/>
+          <w:szCs w:val="24"/>
+        </w:rPr>
+      </w:pPr>
+    </w:p>
+    <w:p>
+      <w:pPr>
+        <w:jc w:val="both"/>
+        <w:rPr>
+          <w:rFonts w:ascii="Times New Roman" w:hAnsi="Times New Roman" w:cs="Times New Roman"/>
+          <w:sz w:val="24"/>
+          <w:szCs w:val="24"/>
+        </w:rPr>
+      </w:pPr>
+    </w:p>
+    <w:p>
+      <w:pPr>
+        <w:jc w:val="both"/>
+        <w:rPr>
+          <w:rFonts w:ascii="Times New Roman" w:hAnsi="Times New Roman" w:cs="Times New Roman"/>
+          <w:sz w:val="24"/>
+          <w:szCs w:val="24"/>
+        </w:rPr>
+      </w:pPr>
+    </w:p>
+    <w:p>
+      <w:pPr>
+        <w:jc w:val="both"/>
+        <w:rPr>
+          <w:rFonts w:ascii="Times New Roman" w:hAnsi="Times New Roman" w:cs="Times New Roman"/>
+          <w:sz w:val="24"/>
+          <w:szCs w:val="24"/>
+        </w:rPr>
+      </w:pPr>
+    </w:p>
+    <w:p>
+      <w:pPr>
+        <w:jc w:val="both"/>
+        <w:rPr>
+          <w:rFonts w:ascii="Times New Roman" w:hAnsi="Times New Roman" w:cs="Times New Roman"/>
+          <w:sz w:val="24"/>
+          <w:szCs w:val="24"/>
+        </w:rPr>
+      </w:pPr>
+    </w:p>
+    <w:p>
+      <w:pPr>
+        <w:jc w:val="both"/>
+        <w:rPr>
+          <w:rFonts w:ascii="Times New Roman" w:hAnsi="Times New Roman" w:cs="Times New Roman"/>
+          <w:sz w:val="24"/>
+          <w:szCs w:val="24"/>
+        </w:rPr>
+      </w:pPr>
+    </w:p>
+    <w:p>
+      <w:pPr>
+        <w:jc w:val="both"/>
+        <w:rPr>
+          <w:rFonts w:ascii="Times New Roman" w:hAnsi="Times New Roman" w:cs="Times New Roman"/>
+          <w:sz w:val="24"/>
+          <w:szCs w:val="24"/>
+        </w:rPr>
+      </w:pPr>
+    </w:p>
+    <w:p>
+      <w:pPr>
+        <w:jc w:val="both"/>
+        <w:rPr>
+          <w:rFonts w:ascii="Times New Roman" w:hAnsi="Times New Roman" w:cs="Times New Roman"/>
+          <w:sz w:val="24"/>
+          <w:szCs w:val="24"/>
+        </w:rPr>
+      </w:pPr>
+    </w:p>
+    <w:p>
+      <w:pPr>
+        <w:jc w:val="both"/>
+        <w:rPr>
+          <w:rFonts w:ascii="Times New Roman" w:hAnsi="Times New Roman" w:cs="Times New Roman"/>
+          <w:sz w:val="24"/>
+          <w:szCs w:val="24"/>
+        </w:rPr>
+      </w:pPr>
+    </w:p>
+    <w:p>
+      <w:pPr>
+        <w:jc w:val="both"/>
         <w:rPr>
           <w:rFonts w:ascii="Times New Roman" w:hAnsi="Times New Roman" w:cs="Times New Roman"/>
           <w:b/>
@@ -726,313 +1303,8 @@
           <w:szCs w:val="24"/>
           <w:u w:val="single"/>
         </w:rPr>
-        <w:t>. convert_pdf_images</w:t>
-      </w:r>
-    </w:p>
-    <w:p>
-      <w:pPr>
-        <w:jc w:val="both"/>
-        <w:rPr>
-          <w:rFonts w:ascii="Times New Roman" w:hAnsi="Times New Roman" w:cs="Times New Roman"/>
-          <w:sz w:val="24"/>
-          <w:szCs w:val="24"/>
-        </w:rPr>
-      </w:pPr>
-      <w:r>
-        <w:rPr>
-          <w:rFonts w:ascii="Times New Roman" w:hAnsi="Times New Roman" w:cs="Times New Roman"/>
-          <w:sz w:val="24"/>
-          <w:szCs w:val="24"/>
-        </w:rPr>
-        <w:t>Windows:</w:t>
-      </w:r>
-      <w:r>
-        <w:rPr>
-          <w:rFonts w:ascii="Times New Roman" w:hAnsi="Times New Roman" w:cs="Times New Roman"/>
-          <w:sz w:val="24"/>
-          <w:szCs w:val="24"/>
-        </w:rPr>
-        <w:br/>
-        <w:t xml:space="preserve">pyinstaller --onefile --name convert_pdf_images --hidden-import=fitz --hidden-import=PyMuPDF --hidden-import=PIL --hidden-import=PIL.Image --collect-all fitz </w:t>
-      </w:r>
-      <w:r>
-        <w:rPr>
-          <w:rFonts w:ascii="Times New Roman" w:hAnsi="Times New Roman" w:cs="Times New Roman"/>
-          <w:sz w:val="24"/>
-          <w:szCs w:val="24"/>
-        </w:rPr>
-        <w:t>--collect-all PyMuPDF --collect-all PIL convert_pdf_images.py</w:t>
-      </w:r>
-    </w:p>
-    <w:p>
-      <w:pPr>
-        <w:jc w:val="both"/>
-        <w:rPr>
-          <w:rFonts w:ascii="Times New Roman" w:hAnsi="Times New Roman" w:cs="Times New Roman"/>
-          <w:sz w:val="24"/>
-          <w:szCs w:val="24"/>
-        </w:rPr>
-      </w:pPr>
-    </w:p>
-    <w:p>
-      <w:pPr>
-        <w:jc w:val="both"/>
-        <w:rPr>
-          <w:rFonts w:ascii="Times New Roman" w:hAnsi="Times New Roman" w:cs="Times New Roman"/>
-          <w:sz w:val="24"/>
-          <w:szCs w:val="24"/>
-        </w:rPr>
-      </w:pPr>
-      <w:r>
-        <w:rPr>
-          <w:rFonts w:ascii="Times New Roman" w:hAnsi="Times New Roman" w:cs="Times New Roman"/>
-          <w:sz w:val="24"/>
-          <w:szCs w:val="24"/>
-        </w:rPr>
-        <w:t>Linux:</w:t>
-      </w:r>
-      <w:r>
-        <w:rPr>
-          <w:rFonts w:ascii="Times New Roman" w:hAnsi="Times New Roman" w:cs="Times New Roman"/>
-          <w:sz w:val="24"/>
-          <w:szCs w:val="24"/>
-        </w:rPr>
-        <w:br/>
-        <w:t>pyinstaller --onefile --name convert_pdf_images --hidden-import=fitz --hidden-import=PyMuPDF --hidden-import=PIL --hidden-import=PIL.Image --collect-all fitz --collect-all PyMuPDF --coll</w:t>
-      </w:r>
-      <w:r>
-        <w:rPr>
-          <w:rFonts w:ascii="Times New Roman" w:hAnsi="Times New Roman" w:cs="Times New Roman"/>
-          <w:sz w:val="24"/>
-          <w:szCs w:val="24"/>
-        </w:rPr>
-        <w:t>ect-all PIL convert_pdf_images.py</w:t>
-      </w:r>
-    </w:p>
-    <w:p>
-      <w:pPr>
-        <w:jc w:val="both"/>
-        <w:rPr>
-          <w:rFonts w:ascii="Times New Roman" w:hAnsi="Times New Roman" w:cs="Times New Roman"/>
-          <w:sz w:val="24"/>
-          <w:szCs w:val="24"/>
-        </w:rPr>
-      </w:pPr>
-      <w:r>
-        <w:rPr>
-          <w:rFonts w:ascii="Times New Roman" w:hAnsi="Times New Roman" w:cs="Times New Roman"/>
-          <w:sz w:val="24"/>
-          <w:szCs w:val="24"/>
-        </w:rPr>
-        <w:t>chmod +x dist/convert_pdf_images</w:t>
-      </w:r>
-    </w:p>
-    <w:p>
-      <w:pPr>
-        <w:jc w:val="both"/>
-        <w:rPr>
-          <w:rFonts w:ascii="Times New Roman" w:hAnsi="Times New Roman" w:cs="Times New Roman"/>
-          <w:sz w:val="24"/>
-          <w:szCs w:val="24"/>
-        </w:rPr>
-      </w:pPr>
-    </w:p>
-    <w:p>
-      <w:pPr>
-        <w:jc w:val="both"/>
-        <w:rPr>
-          <w:rFonts w:ascii="Times New Roman" w:hAnsi="Times New Roman" w:cs="Times New Roman"/>
-          <w:sz w:val="24"/>
-          <w:szCs w:val="24"/>
-        </w:rPr>
-      </w:pPr>
-      <w:r>
-        <w:rPr>
-          <w:rFonts w:ascii="Times New Roman" w:hAnsi="Times New Roman" w:cs="Times New Roman"/>
-          <w:sz w:val="24"/>
-          <w:szCs w:val="24"/>
-        </w:rPr>
-        <w:t>macOS:</w:t>
-      </w:r>
-      <w:r>
-        <w:rPr>
-          <w:rFonts w:ascii="Times New Roman" w:hAnsi="Times New Roman" w:cs="Times New Roman"/>
-          <w:sz w:val="24"/>
-          <w:szCs w:val="24"/>
-        </w:rPr>
-        <w:br/>
-        <w:t>pyinstaller --onefile --name convert_pdf_images --hidden-import=fitz --hidden-import=PyMuPDF --hidden-import=PIL --hidden-import=PIL.Image --collect-all fitz --collect-all PyMuPDF -</w:t>
-      </w:r>
-      <w:r>
-        <w:rPr>
-          <w:rFonts w:ascii="Times New Roman" w:hAnsi="Times New Roman" w:cs="Times New Roman"/>
-          <w:sz w:val="24"/>
-          <w:szCs w:val="24"/>
-        </w:rPr>
-        <w:t>-collect-all PIL convert_pdf_images.py</w:t>
-      </w:r>
-    </w:p>
-    <w:p>
-      <w:pPr>
-        <w:jc w:val="both"/>
-        <w:rPr>
-          <w:rFonts w:ascii="Times New Roman" w:hAnsi="Times New Roman" w:cs="Times New Roman"/>
-          <w:sz w:val="24"/>
-          <w:szCs w:val="24"/>
-        </w:rPr>
-      </w:pPr>
-      <w:r>
-        <w:rPr>
-          <w:rFonts w:ascii="Times New Roman" w:hAnsi="Times New Roman" w:cs="Times New Roman"/>
-          <w:sz w:val="24"/>
-          <w:szCs w:val="24"/>
-        </w:rPr>
-        <w:t>chmod +x dist/convert_pdf_images</w:t>
-      </w:r>
-    </w:p>
-    <w:p>
-      <w:pPr>
-        <w:jc w:val="both"/>
-        <w:rPr>
-          <w:rFonts w:ascii="Times New Roman" w:hAnsi="Times New Roman" w:cs="Times New Roman"/>
-          <w:sz w:val="24"/>
-          <w:szCs w:val="24"/>
-        </w:rPr>
-      </w:pPr>
-    </w:p>
-    <w:p>
-      <w:pPr>
-        <w:jc w:val="both"/>
-        <w:rPr>
-          <w:rFonts w:ascii="Times New Roman" w:hAnsi="Times New Roman" w:cs="Times New Roman"/>
-          <w:sz w:val="24"/>
-          <w:szCs w:val="24"/>
-        </w:rPr>
-      </w:pPr>
-    </w:p>
-    <w:p>
-      <w:pPr>
-        <w:jc w:val="both"/>
-        <w:rPr>
-          <w:rFonts w:ascii="Times New Roman" w:hAnsi="Times New Roman" w:cs="Times New Roman"/>
-          <w:sz w:val="24"/>
-          <w:szCs w:val="24"/>
-        </w:rPr>
-      </w:pPr>
-    </w:p>
-    <w:p>
-      <w:pPr>
-        <w:jc w:val="both"/>
-        <w:rPr>
-          <w:rFonts w:ascii="Times New Roman" w:hAnsi="Times New Roman" w:cs="Times New Roman"/>
-          <w:sz w:val="24"/>
-          <w:szCs w:val="24"/>
-        </w:rPr>
-      </w:pPr>
-    </w:p>
-    <w:p>
-      <w:pPr>
-        <w:jc w:val="both"/>
-        <w:rPr>
-          <w:rFonts w:ascii="Times New Roman" w:hAnsi="Times New Roman" w:cs="Times New Roman"/>
-          <w:sz w:val="24"/>
-          <w:szCs w:val="24"/>
-        </w:rPr>
-      </w:pPr>
-    </w:p>
-    <w:p>
-      <w:pPr>
-        <w:jc w:val="both"/>
-        <w:rPr>
-          <w:rFonts w:ascii="Times New Roman" w:hAnsi="Times New Roman" w:cs="Times New Roman"/>
-          <w:sz w:val="24"/>
-          <w:szCs w:val="24"/>
-        </w:rPr>
-      </w:pPr>
-    </w:p>
-    <w:p>
-      <w:pPr>
-        <w:jc w:val="both"/>
-        <w:rPr>
-          <w:rFonts w:ascii="Times New Roman" w:hAnsi="Times New Roman" w:cs="Times New Roman"/>
-          <w:sz w:val="24"/>
-          <w:szCs w:val="24"/>
-        </w:rPr>
-      </w:pPr>
-    </w:p>
-    <w:p>
-      <w:pPr>
-        <w:jc w:val="both"/>
-        <w:rPr>
-          <w:rFonts w:ascii="Times New Roman" w:hAnsi="Times New Roman" w:cs="Times New Roman"/>
-          <w:sz w:val="24"/>
-          <w:szCs w:val="24"/>
-        </w:rPr>
-      </w:pPr>
-    </w:p>
-    <w:p>
-      <w:pPr>
-        <w:jc w:val="both"/>
-        <w:rPr>
-          <w:rFonts w:ascii="Times New Roman" w:hAnsi="Times New Roman" w:cs="Times New Roman"/>
-          <w:sz w:val="24"/>
-          <w:szCs w:val="24"/>
-        </w:rPr>
-      </w:pPr>
-    </w:p>
-    <w:p>
-      <w:pPr>
-        <w:jc w:val="both"/>
-        <w:rPr>
-          <w:rFonts w:ascii="Times New Roman" w:hAnsi="Times New Roman" w:cs="Times New Roman"/>
-          <w:sz w:val="24"/>
-          <w:szCs w:val="24"/>
-        </w:rPr>
-      </w:pPr>
-    </w:p>
-    <w:p>
-      <w:pPr>
-        <w:jc w:val="both"/>
-        <w:rPr>
-          <w:rFonts w:ascii="Times New Roman" w:hAnsi="Times New Roman" w:cs="Times New Roman"/>
-          <w:sz w:val="24"/>
-          <w:szCs w:val="24"/>
-        </w:rPr>
-      </w:pPr>
-    </w:p>
-    <w:p>
-      <w:pPr>
-        <w:jc w:val="both"/>
-        <w:rPr>
-          <w:rFonts w:ascii="Times New Roman" w:hAnsi="Times New Roman" w:cs="Times New Roman"/>
-          <w:sz w:val="24"/>
-          <w:szCs w:val="24"/>
-        </w:rPr>
-      </w:pPr>
-    </w:p>
-    <w:p>
-      <w:pPr>
-        <w:jc w:val="both"/>
-        <w:rPr>
-          <w:rFonts w:ascii="Times New Roman" w:hAnsi="Times New Roman" w:cs="Times New Roman"/>
-          <w:sz w:val="24"/>
-          <w:szCs w:val="24"/>
-        </w:rPr>
-      </w:pPr>
-    </w:p>
-    <w:p>
-      <w:pPr>
-        <w:jc w:val="both"/>
-        <w:rPr>
-          <w:rFonts w:ascii="Times New Roman" w:hAnsi="Times New Roman" w:cs="Times New Roman"/>
-          <w:sz w:val="24"/>
-          <w:szCs w:val="24"/>
-        </w:rPr>
-      </w:pPr>
-    </w:p>
-    <w:p>
-      <w:pPr>
-        <w:jc w:val="both"/>
+      </w:pPr>
+      <w:r>
         <w:rPr>
           <w:rFonts w:ascii="Times New Roman" w:hAnsi="Times New Roman" w:cs="Times New Roman"/>
           <w:b/>
@@ -1041,29 +1313,8 @@
           <w:szCs w:val="24"/>
           <w:u w:val="single"/>
         </w:rPr>
-      </w:pPr>
-      <w:r>
-        <w:rPr>
-          <w:rFonts w:ascii="Times New Roman" w:hAnsi="Times New Roman" w:cs="Times New Roman"/>
-          <w:b/>
-          <w:bCs/>
-          <w:sz w:val="24"/>
-          <w:szCs w:val="24"/>
-          <w:u w:val="single"/>
-        </w:rPr>
         <w:lastRenderedPageBreak/>
-        <w:t>4</w:t>
-      </w:r>
-      <w:r>
-        <w:rPr>
-          <w:rFonts w:ascii="Times New Roman" w:hAnsi="Times New Roman" w:cs="Times New Roman"/>
-          <w:b/>
-          <w:bCs/>
-          <w:sz w:val="24"/>
-          <w:szCs w:val="24"/>
-          <w:u w:val="single"/>
-        </w:rPr>
-        <w:t>. redact_pdf</w:t>
+        <w:t>4. redact_pdf</w:t>
       </w:r>
     </w:p>
     <w:p>
@@ -1090,13 +1341,6 @@
           <w:szCs w:val="24"/>
         </w:rPr>
         <w:br/>
-      </w:r>
-      <w:r>
-        <w:rPr>
-          <w:rFonts w:ascii="Times New Roman" w:hAnsi="Times New Roman" w:cs="Times New Roman"/>
-          <w:sz w:val="24"/>
-          <w:szCs w:val="24"/>
-        </w:rPr>
         <w:t>pyinstaller --onefile --name redact_pdf --hidden-import=fitz --hidden-import=PyMuPDF --collect-all fitz --collect-all PyMuPDF redact_pdf.py</w:t>
       </w:r>
     </w:p>
@@ -1143,7 +1387,7 @@
           <w:sz w:val="24"/>
           <w:szCs w:val="24"/>
         </w:rPr>
-        <w:t>pyinstaller --onefile name redact_pdf hidden-import=fitz hidden-import=PyMuPDF collect-all fitz collect-all PyMuPDF redact_pdf.py</w:t>
+        <w:t xml:space="preserve">pyinstaller --onefile --name redact_pdf --hidden-import=fitz --hidden-import=PyMuPDF --collect-all fitz --collect-all PyMuPDF redact_pdf.py </w:t>
       </w:r>
     </w:p>
     <w:p>
@@ -1189,15 +1433,7 @@
           <w:sz w:val="24"/>
           <w:szCs w:val="24"/>
         </w:rPr>
-        <w:t>m</w:t>
-      </w:r>
-      <w:r>
-        <w:rPr>
-          <w:rFonts w:ascii="Times New Roman" w:hAnsi="Times New Roman" w:cs="Times New Roman"/>
-          <w:sz w:val="24"/>
-          <w:szCs w:val="24"/>
-        </w:rPr>
-        <w:t>acOS:</w:t>
+        <w:t>macOS:</w:t>
       </w:r>
       <w:r>
         <w:rPr>
@@ -1206,14 +1442,7 @@
           <w:szCs w:val="24"/>
         </w:rPr>
         <w:br/>
-      </w:r>
-      <w:r>
-        <w:rPr>
-          <w:rFonts w:ascii="Times New Roman" w:hAnsi="Times New Roman" w:cs="Times New Roman"/>
-          <w:sz w:val="24"/>
-          <w:szCs w:val="24"/>
-        </w:rPr>
-        <w:t>pyinstaller --onefile name redact_pdf hidden-import=fitz hidden-import=PyMuPDF collect-all fitz collect-all PyMuPDF redact_pdf.py</w:t>
+        <w:t>pyinstaller --onefile --name redact_pdf --hidden-import=fitz --hidden-import=PyMuPDF --collect-all fitz --collect-all PyMuPDF redact_pdf.py</w:t>
       </w:r>
     </w:p>
     <w:p>
@@ -1239,10 +1468,247 @@
       <w:pgMar w:top="1440" w:right="1440" w:bottom="1440" w:left="1440" w:header="0" w:footer="0" w:gutter="0"/>
       <w:cols w:space="720"/>
       <w:formProt w:val="0"/>
-      <w:docGrid w:linePitch="360" w:charSpace="4096"/>
+      <w:docGrid w:linePitch="360" w:charSpace="8192"/>
     </w:sectPr>
   </w:body>
 </w:document>
+</file>
+
+<file path=word/numbering.xml><?xml version="1.0" encoding="utf-8"?>
+<w:numbering xmlns:wpc="http://schemas.microsoft.com/office/word/2010/wordprocessingCanvas" xmlns:cx="http://schemas.microsoft.com/office/drawing/2014/chartex" xmlns:cx1="http://schemas.microsoft.com/office/drawing/2015/9/8/chartex" xmlns:cx2="http://schemas.microsoft.com/office/drawing/2015/10/21/chartex" xmlns:cx3="http://schemas.microsoft.com/office/drawing/2016/5/9/chartex" xmlns:cx4="http://schemas.microsoft.com/office/drawing/2016/5/10/chartex" xmlns:cx5="http://schemas.microsoft.com/office/drawing/2016/5/11/chartex" xmlns:cx6="http://schemas.microsoft.com/office/drawing/2016/5/12/chartex" xmlns:cx7="http://schemas.microsoft.com/office/drawing/2016/5/13/chartex" xmlns:cx8="http://schemas.microsoft.com/office/drawing/2016/5/14/chartex" xmlns:mc="http://schemas.openxmlformats.org/markup-compatibility/2006" xmlns:aink="http://schemas.microsoft.com/office/drawing/2016/ink" xmlns:am3d="http://schemas.microsoft.com/office/drawing/2017/model3d" xmlns:o="urn:schemas-microsoft-com:office:office" xmlns:r="http://schemas.openxmlformats.org/officeDocument/2006/relationships" xmlns:m="http://schemas.openxmlformats.org/officeDocument/2006/math" xmlns:v="urn:schemas-microsoft-com:vml" xmlns:wp14="http://schemas.microsoft.com/office/word/2010/wordprocessingDrawing" xmlns:wp="http://schemas.openxmlformats.org/drawingml/2006/wordprocessingDrawing" xmlns:w10="urn:schemas-microsoft-com:office:word" xmlns:w="http://schemas.openxmlformats.org/wordprocessingml/2006/main" xmlns:w14="http://schemas.microsoft.com/office/word/2010/wordml" xmlns:w15="http://schemas.microsoft.com/office/word/2012/wordml" xmlns:w16cex="http://schemas.microsoft.com/office/word/2018/wordml/cex" xmlns:w16cid="http://schemas.microsoft.com/office/word/2016/wordml/cid" xmlns:w16="http://schemas.microsoft.com/office/word/2018/wordml" xmlns:w16sdtdh="http://schemas.microsoft.com/office/word/2020/wordml/sdtdatahash" xmlns:w16se="http://schemas.microsoft.com/office/word/2015/wordml/symex" xmlns:wpg="http://schemas.microsoft.com/office/word/2010/wordprocessingGroup" xmlns:wpi="http://schemas.microsoft.com/office/word/2010/wordprocessingInk" xmlns:wne="http://schemas.microsoft.com/office/word/2006/wordml" xmlns:wps="http://schemas.microsoft.com/office/word/2010/wordprocessingShape" mc:Ignorable="w14 w15 w16se w16cid w16 w16cex w16sdtdh wp14">
+  <w:abstractNum w:abstractNumId="0" w15:restartNumberingAfterBreak="0">
+    <w:nsid w:val="36935653"/>
+    <w:multiLevelType w:val="hybridMultilevel"/>
+    <w:tmpl w:val="FF2E52E0"/>
+    <w:lvl w:ilvl="0" w:tplc="04090001">
+      <w:start w:val="1"/>
+      <w:numFmt w:val="bullet"/>
+      <w:lvlText w:val=""/>
+      <w:lvlJc w:val="left"/>
+      <w:pPr>
+        <w:ind w:left="720" w:hanging="360"/>
+      </w:pPr>
+      <w:rPr>
+        <w:rFonts w:ascii="Symbol" w:hAnsi="Symbol" w:hint="default"/>
+      </w:rPr>
+    </w:lvl>
+    <w:lvl w:ilvl="1" w:tplc="04090003" w:tentative="1">
+      <w:start w:val="1"/>
+      <w:numFmt w:val="bullet"/>
+      <w:lvlText w:val="o"/>
+      <w:lvlJc w:val="left"/>
+      <w:pPr>
+        <w:ind w:left="1440" w:hanging="360"/>
+      </w:pPr>
+      <w:rPr>
+        <w:rFonts w:ascii="Courier New" w:hAnsi="Courier New" w:cs="Courier New" w:hint="default"/>
+      </w:rPr>
+    </w:lvl>
+    <w:lvl w:ilvl="2" w:tplc="04090005" w:tentative="1">
+      <w:start w:val="1"/>
+      <w:numFmt w:val="bullet"/>
+      <w:lvlText w:val=""/>
+      <w:lvlJc w:val="left"/>
+      <w:pPr>
+        <w:ind w:left="2160" w:hanging="360"/>
+      </w:pPr>
+      <w:rPr>
+        <w:rFonts w:ascii="Wingdings" w:hAnsi="Wingdings" w:hint="default"/>
+      </w:rPr>
+    </w:lvl>
+    <w:lvl w:ilvl="3" w:tplc="04090001" w:tentative="1">
+      <w:start w:val="1"/>
+      <w:numFmt w:val="bullet"/>
+      <w:lvlText w:val=""/>
+      <w:lvlJc w:val="left"/>
+      <w:pPr>
+        <w:ind w:left="2880" w:hanging="360"/>
+      </w:pPr>
+      <w:rPr>
+        <w:rFonts w:ascii="Symbol" w:hAnsi="Symbol" w:hint="default"/>
+      </w:rPr>
+    </w:lvl>
+    <w:lvl w:ilvl="4" w:tplc="04090003" w:tentative="1">
+      <w:start w:val="1"/>
+      <w:numFmt w:val="bullet"/>
+      <w:lvlText w:val="o"/>
+      <w:lvlJc w:val="left"/>
+      <w:pPr>
+        <w:ind w:left="3600" w:hanging="360"/>
+      </w:pPr>
+      <w:rPr>
+        <w:rFonts w:ascii="Courier New" w:hAnsi="Courier New" w:cs="Courier New" w:hint="default"/>
+      </w:rPr>
+    </w:lvl>
+    <w:lvl w:ilvl="5" w:tplc="04090005" w:tentative="1">
+      <w:start w:val="1"/>
+      <w:numFmt w:val="bullet"/>
+      <w:lvlText w:val=""/>
+      <w:lvlJc w:val="left"/>
+      <w:pPr>
+        <w:ind w:left="4320" w:hanging="360"/>
+      </w:pPr>
+      <w:rPr>
+        <w:rFonts w:ascii="Wingdings" w:hAnsi="Wingdings" w:hint="default"/>
+      </w:rPr>
+    </w:lvl>
+    <w:lvl w:ilvl="6" w:tplc="04090001" w:tentative="1">
+      <w:start w:val="1"/>
+      <w:numFmt w:val="bullet"/>
+      <w:lvlText w:val=""/>
+      <w:lvlJc w:val="left"/>
+      <w:pPr>
+        <w:ind w:left="5040" w:hanging="360"/>
+      </w:pPr>
+      <w:rPr>
+        <w:rFonts w:ascii="Symbol" w:hAnsi="Symbol" w:hint="default"/>
+      </w:rPr>
+    </w:lvl>
+    <w:lvl w:ilvl="7" w:tplc="04090003" w:tentative="1">
+      <w:start w:val="1"/>
+      <w:numFmt w:val="bullet"/>
+      <w:lvlText w:val="o"/>
+      <w:lvlJc w:val="left"/>
+      <w:pPr>
+        <w:ind w:left="5760" w:hanging="360"/>
+      </w:pPr>
+      <w:rPr>
+        <w:rFonts w:ascii="Courier New" w:hAnsi="Courier New" w:cs="Courier New" w:hint="default"/>
+      </w:rPr>
+    </w:lvl>
+    <w:lvl w:ilvl="8" w:tplc="04090005" w:tentative="1">
+      <w:start w:val="1"/>
+      <w:numFmt w:val="bullet"/>
+      <w:lvlText w:val=""/>
+      <w:lvlJc w:val="left"/>
+      <w:pPr>
+        <w:ind w:left="6480" w:hanging="360"/>
+      </w:pPr>
+      <w:rPr>
+        <w:rFonts w:ascii="Wingdings" w:hAnsi="Wingdings" w:hint="default"/>
+      </w:rPr>
+    </w:lvl>
+  </w:abstractNum>
+  <w:abstractNum w:abstractNumId="1" w15:restartNumberingAfterBreak="0">
+    <w:nsid w:val="46C2432D"/>
+    <w:multiLevelType w:val="hybridMultilevel"/>
+    <w:tmpl w:val="A0427060"/>
+    <w:lvl w:ilvl="0" w:tplc="04090001">
+      <w:start w:val="1"/>
+      <w:numFmt w:val="bullet"/>
+      <w:lvlText w:val=""/>
+      <w:lvlJc w:val="left"/>
+      <w:pPr>
+        <w:ind w:left="720" w:hanging="360"/>
+      </w:pPr>
+      <w:rPr>
+        <w:rFonts w:ascii="Symbol" w:hAnsi="Symbol" w:hint="default"/>
+      </w:rPr>
+    </w:lvl>
+    <w:lvl w:ilvl="1" w:tplc="04090003" w:tentative="1">
+      <w:start w:val="1"/>
+      <w:numFmt w:val="bullet"/>
+      <w:lvlText w:val="o"/>
+      <w:lvlJc w:val="left"/>
+      <w:pPr>
+        <w:ind w:left="1440" w:hanging="360"/>
+      </w:pPr>
+      <w:rPr>
+        <w:rFonts w:ascii="Courier New" w:hAnsi="Courier New" w:cs="Courier New" w:hint="default"/>
+      </w:rPr>
+    </w:lvl>
+    <w:lvl w:ilvl="2" w:tplc="04090005" w:tentative="1">
+      <w:start w:val="1"/>
+      <w:numFmt w:val="bullet"/>
+      <w:lvlText w:val=""/>
+      <w:lvlJc w:val="left"/>
+      <w:pPr>
+        <w:ind w:left="2160" w:hanging="360"/>
+      </w:pPr>
+      <w:rPr>
+        <w:rFonts w:ascii="Wingdings" w:hAnsi="Wingdings" w:hint="default"/>
+      </w:rPr>
+    </w:lvl>
+    <w:lvl w:ilvl="3" w:tplc="04090001" w:tentative="1">
+      <w:start w:val="1"/>
+      <w:numFmt w:val="bullet"/>
+      <w:lvlText w:val=""/>
+      <w:lvlJc w:val="left"/>
+      <w:pPr>
+        <w:ind w:left="2880" w:hanging="360"/>
+      </w:pPr>
+      <w:rPr>
+        <w:rFonts w:ascii="Symbol" w:hAnsi="Symbol" w:hint="default"/>
+      </w:rPr>
+    </w:lvl>
+    <w:lvl w:ilvl="4" w:tplc="04090003" w:tentative="1">
+      <w:start w:val="1"/>
+      <w:numFmt w:val="bullet"/>
+      <w:lvlText w:val="o"/>
+      <w:lvlJc w:val="left"/>
+      <w:pPr>
+        <w:ind w:left="3600" w:hanging="360"/>
+      </w:pPr>
+      <w:rPr>
+        <w:rFonts w:ascii="Courier New" w:hAnsi="Courier New" w:cs="Courier New" w:hint="default"/>
+      </w:rPr>
+    </w:lvl>
+    <w:lvl w:ilvl="5" w:tplc="04090005" w:tentative="1">
+      <w:start w:val="1"/>
+      <w:numFmt w:val="bullet"/>
+      <w:lvlText w:val=""/>
+      <w:lvlJc w:val="left"/>
+      <w:pPr>
+        <w:ind w:left="4320" w:hanging="360"/>
+      </w:pPr>
+      <w:rPr>
+        <w:rFonts w:ascii="Wingdings" w:hAnsi="Wingdings" w:hint="default"/>
+      </w:rPr>
+    </w:lvl>
+    <w:lvl w:ilvl="6" w:tplc="04090001" w:tentative="1">
+      <w:start w:val="1"/>
+      <w:numFmt w:val="bullet"/>
+      <w:lvlText w:val=""/>
+      <w:lvlJc w:val="left"/>
+      <w:pPr>
+        <w:ind w:left="5040" w:hanging="360"/>
+      </w:pPr>
+      <w:rPr>
+        <w:rFonts w:ascii="Symbol" w:hAnsi="Symbol" w:hint="default"/>
+      </w:rPr>
+    </w:lvl>
+    <w:lvl w:ilvl="7" w:tplc="04090003" w:tentative="1">
+      <w:start w:val="1"/>
+      <w:numFmt w:val="bullet"/>
+      <w:lvlText w:val="o"/>
+      <w:lvlJc w:val="left"/>
+      <w:pPr>
+        <w:ind w:left="5760" w:hanging="360"/>
+      </w:pPr>
+      <w:rPr>
+        <w:rFonts w:ascii="Courier New" w:hAnsi="Courier New" w:cs="Courier New" w:hint="default"/>
+      </w:rPr>
+    </w:lvl>
+    <w:lvl w:ilvl="8" w:tplc="04090005" w:tentative="1">
+      <w:start w:val="1"/>
+      <w:numFmt w:val="bullet"/>
+      <w:lvlText w:val=""/>
+      <w:lvlJc w:val="left"/>
+      <w:pPr>
+        <w:ind w:left="6480" w:hanging="360"/>
+      </w:pPr>
+      <w:rPr>
+        <w:rFonts w:ascii="Wingdings" w:hAnsi="Wingdings" w:hint="default"/>
+      </w:rPr>
+    </w:lvl>
+  </w:abstractNum>
+  <w:num w:numId="1">
+    <w:abstractNumId w:val="0"/>
+  </w:num>
+  <w:num w:numId="2">
+    <w:abstractNumId w:val="1"/>
+  </w:num>
+</w:numbering>
 </file>
 
 <file path=word/styles.xml><?xml version="1.0" encoding="utf-8"?>

</xml_diff>

<commit_message>
An issue fixed where entire image redacted on partial selection in PDF - Windows
</commit_message>
<xml_diff>
--- a/docs/Python executable build process.docx
+++ b/docs/Python executable build process.docx
@@ -92,6 +92,14 @@
         </w:rPr>
         <w:t>pip install PyMuPDF pikepdf pyinstaller</w:t>
       </w:r>
+      <w:r>
+        <w:rPr>
+          <w:rFonts w:ascii="Times New Roman" w:hAnsi="Times New Roman" w:cs="Times New Roman"/>
+          <w:sz w:val="24"/>
+          <w:szCs w:val="24"/>
+        </w:rPr>
+        <w:t xml:space="preserve"> pillow</w:t>
+      </w:r>
     </w:p>
     <w:p>
       <w:pPr>
@@ -1341,7 +1349,14 @@
           <w:szCs w:val="24"/>
         </w:rPr>
         <w:br/>
-        <w:t>pyinstaller --onefile --name redact_pdf --hidden-import=fitz --hidden-import=PyMuPDF --collect-all fitz --collect-all PyMuPDF redact_pdf.py</w:t>
+      </w:r>
+      <w:r>
+        <w:rPr>
+          <w:rFonts w:ascii="Times New Roman" w:hAnsi="Times New Roman" w:cs="Times New Roman"/>
+          <w:sz w:val="24"/>
+          <w:szCs w:val="24"/>
+        </w:rPr>
+        <w:t>pyinstaller --onefile --name redact_pdf --hidden-import=fitz --hidden-import=PyMuPDF --hidden-import=PIL --collect-all fitz --collect-all PyMuPDF --collect-all PIL redact_pdf.py</w:t>
       </w:r>
     </w:p>
     <w:p>
@@ -1387,7 +1402,15 @@
           <w:sz w:val="24"/>
           <w:szCs w:val="24"/>
         </w:rPr>
-        <w:t xml:space="preserve">pyinstaller --onefile --name redact_pdf --hidden-import=fitz --hidden-import=PyMuPDF --collect-all fitz --collect-all PyMuPDF redact_pdf.py </w:t>
+        <w:t>pyinstaller --onefile --name redact_pdf --hidden-import=fitz --hidden-import=PyMuPDF --hidden-import=PIL --collect-all fitz --collect-all PyMuPDF --collect-all PIL redact_pdf.py</w:t>
+      </w:r>
+      <w:r>
+        <w:rPr>
+          <w:rFonts w:ascii="Times New Roman" w:hAnsi="Times New Roman" w:cs="Times New Roman"/>
+          <w:sz w:val="24"/>
+          <w:szCs w:val="24"/>
+        </w:rPr>
+        <w:t xml:space="preserve"> </w:t>
       </w:r>
     </w:p>
     <w:p>
@@ -1442,7 +1465,14 @@
           <w:szCs w:val="24"/>
         </w:rPr>
         <w:br/>
-        <w:t>pyinstaller --onefile --name redact_pdf --hidden-import=fitz --hidden-import=PyMuPDF --collect-all fitz --collect-all PyMuPDF redact_pdf.py</w:t>
+      </w:r>
+      <w:r>
+        <w:rPr>
+          <w:rFonts w:ascii="Times New Roman" w:hAnsi="Times New Roman" w:cs="Times New Roman"/>
+          <w:sz w:val="24"/>
+          <w:szCs w:val="24"/>
+        </w:rPr>
+        <w:t>pyinstaller --onefile --name redact_pdf --hidden-import=fitz --hidden-import=PyMuPDF --hidden-import=PIL --collect-all fitz --collect-all PyMuPDF --collect-all PIL redact_pdf.py</w:t>
       </w:r>
     </w:p>
     <w:p>

</xml_diff>

<commit_message>
Feature #6 = PDF to Grayscale conversion implemented
TODO: More testing needed. And implemented for windows only for now.
</commit_message>
<xml_diff>
--- a/docs/Python executable build process.docx
+++ b/docs/Python executable build process.docx
@@ -48,7 +48,6 @@
     </w:p>
     <w:p>
       <w:pPr>
-        <w:jc w:val="both"/>
         <w:rPr>
           <w:rFonts w:ascii="Times New Roman" w:hAnsi="Times New Roman" w:cs="Times New Roman"/>
           <w:b/>
@@ -77,7 +76,6 @@
           <w:ilvl w:val="0"/>
           <w:numId w:val="2"/>
         </w:numPr>
-        <w:jc w:val="both"/>
         <w:rPr>
           <w:rFonts w:ascii="Times New Roman" w:hAnsi="Times New Roman" w:cs="Times New Roman"/>
           <w:sz w:val="24"/>
@@ -103,7 +101,6 @@
     </w:p>
     <w:p>
       <w:pPr>
-        <w:jc w:val="both"/>
         <w:rPr>
           <w:b/>
           <w:bCs/>
@@ -141,7 +138,6 @@
           <w:ilvl w:val="0"/>
           <w:numId w:val="1"/>
         </w:numPr>
-        <w:jc w:val="both"/>
         <w:rPr>
           <w:rFonts w:ascii="Times New Roman" w:hAnsi="Times New Roman" w:cs="Times New Roman"/>
           <w:sz w:val="24"/>
@@ -164,7 +160,6 @@
           <w:ilvl w:val="0"/>
           <w:numId w:val="1"/>
         </w:numPr>
-        <w:jc w:val="both"/>
         <w:rPr>
           <w:rFonts w:ascii="Times New Roman" w:hAnsi="Times New Roman" w:cs="Times New Roman"/>
           <w:sz w:val="24"/>
@@ -182,207 +177,186 @@
     </w:p>
     <w:p>
       <w:pPr>
-        <w:jc w:val="both"/>
-        <w:rPr>
-          <w:rFonts w:ascii="Times New Roman" w:hAnsi="Times New Roman" w:cs="Times New Roman"/>
-          <w:sz w:val="24"/>
-          <w:szCs w:val="24"/>
-        </w:rPr>
-      </w:pPr>
-    </w:p>
-    <w:p>
-      <w:pPr>
-        <w:jc w:val="both"/>
-        <w:rPr>
-          <w:rFonts w:ascii="Times New Roman" w:hAnsi="Times New Roman" w:cs="Times New Roman"/>
-          <w:sz w:val="24"/>
-          <w:szCs w:val="24"/>
-        </w:rPr>
-      </w:pPr>
-    </w:p>
-    <w:p>
-      <w:pPr>
-        <w:jc w:val="both"/>
-        <w:rPr>
-          <w:rFonts w:ascii="Times New Roman" w:hAnsi="Times New Roman" w:cs="Times New Roman"/>
-          <w:sz w:val="24"/>
-          <w:szCs w:val="24"/>
-        </w:rPr>
-      </w:pPr>
-    </w:p>
-    <w:p>
-      <w:pPr>
-        <w:jc w:val="both"/>
-        <w:rPr>
-          <w:rFonts w:ascii="Times New Roman" w:hAnsi="Times New Roman" w:cs="Times New Roman"/>
-          <w:sz w:val="24"/>
-          <w:szCs w:val="24"/>
-        </w:rPr>
-      </w:pPr>
-    </w:p>
-    <w:p>
-      <w:pPr>
-        <w:jc w:val="both"/>
-        <w:rPr>
-          <w:rFonts w:ascii="Times New Roman" w:hAnsi="Times New Roman" w:cs="Times New Roman"/>
-          <w:sz w:val="24"/>
-          <w:szCs w:val="24"/>
-        </w:rPr>
-      </w:pPr>
-    </w:p>
-    <w:p>
-      <w:pPr>
-        <w:jc w:val="both"/>
-        <w:rPr>
-          <w:rFonts w:ascii="Times New Roman" w:hAnsi="Times New Roman" w:cs="Times New Roman"/>
-          <w:sz w:val="24"/>
-          <w:szCs w:val="24"/>
-        </w:rPr>
-      </w:pPr>
-    </w:p>
-    <w:p>
-      <w:pPr>
-        <w:jc w:val="both"/>
-        <w:rPr>
-          <w:rFonts w:ascii="Times New Roman" w:hAnsi="Times New Roman" w:cs="Times New Roman"/>
-          <w:sz w:val="24"/>
-          <w:szCs w:val="24"/>
-        </w:rPr>
-      </w:pPr>
-    </w:p>
-    <w:p>
-      <w:pPr>
-        <w:jc w:val="both"/>
-        <w:rPr>
-          <w:rFonts w:ascii="Times New Roman" w:hAnsi="Times New Roman" w:cs="Times New Roman"/>
-          <w:sz w:val="24"/>
-          <w:szCs w:val="24"/>
-        </w:rPr>
-      </w:pPr>
-    </w:p>
-    <w:p>
-      <w:pPr>
-        <w:jc w:val="both"/>
-        <w:rPr>
-          <w:rFonts w:ascii="Times New Roman" w:hAnsi="Times New Roman" w:cs="Times New Roman"/>
-          <w:sz w:val="24"/>
-          <w:szCs w:val="24"/>
-        </w:rPr>
-      </w:pPr>
-    </w:p>
-    <w:p>
-      <w:pPr>
-        <w:jc w:val="both"/>
-        <w:rPr>
-          <w:rFonts w:ascii="Times New Roman" w:hAnsi="Times New Roman" w:cs="Times New Roman"/>
-          <w:sz w:val="24"/>
-          <w:szCs w:val="24"/>
-        </w:rPr>
-      </w:pPr>
-    </w:p>
-    <w:p>
-      <w:pPr>
-        <w:jc w:val="both"/>
-        <w:rPr>
-          <w:rFonts w:ascii="Times New Roman" w:hAnsi="Times New Roman" w:cs="Times New Roman"/>
-          <w:sz w:val="24"/>
-          <w:szCs w:val="24"/>
-        </w:rPr>
-      </w:pPr>
-    </w:p>
-    <w:p>
-      <w:pPr>
-        <w:jc w:val="both"/>
-        <w:rPr>
-          <w:rFonts w:ascii="Times New Roman" w:hAnsi="Times New Roman" w:cs="Times New Roman"/>
-          <w:sz w:val="24"/>
-          <w:szCs w:val="24"/>
-        </w:rPr>
-      </w:pPr>
-    </w:p>
-    <w:p>
-      <w:pPr>
-        <w:jc w:val="both"/>
-        <w:rPr>
-          <w:rFonts w:ascii="Times New Roman" w:hAnsi="Times New Roman" w:cs="Times New Roman"/>
-          <w:sz w:val="24"/>
-          <w:szCs w:val="24"/>
-        </w:rPr>
-      </w:pPr>
-    </w:p>
-    <w:p>
-      <w:pPr>
-        <w:jc w:val="both"/>
-        <w:rPr>
-          <w:rFonts w:ascii="Times New Roman" w:hAnsi="Times New Roman" w:cs="Times New Roman"/>
-          <w:sz w:val="24"/>
-          <w:szCs w:val="24"/>
-        </w:rPr>
-      </w:pPr>
-    </w:p>
-    <w:p>
-      <w:pPr>
-        <w:jc w:val="both"/>
-        <w:rPr>
-          <w:rFonts w:ascii="Times New Roman" w:hAnsi="Times New Roman" w:cs="Times New Roman"/>
-          <w:sz w:val="24"/>
-          <w:szCs w:val="24"/>
-        </w:rPr>
-      </w:pPr>
-    </w:p>
-    <w:p>
-      <w:pPr>
-        <w:jc w:val="both"/>
-        <w:rPr>
-          <w:rFonts w:ascii="Times New Roman" w:hAnsi="Times New Roman" w:cs="Times New Roman"/>
-          <w:sz w:val="24"/>
-          <w:szCs w:val="24"/>
-        </w:rPr>
-      </w:pPr>
-    </w:p>
-    <w:p>
-      <w:pPr>
-        <w:jc w:val="both"/>
-        <w:rPr>
-          <w:rFonts w:ascii="Times New Roman" w:hAnsi="Times New Roman" w:cs="Times New Roman"/>
-          <w:sz w:val="24"/>
-          <w:szCs w:val="24"/>
-        </w:rPr>
-      </w:pPr>
-    </w:p>
-    <w:p>
-      <w:pPr>
-        <w:jc w:val="both"/>
-        <w:rPr>
-          <w:rFonts w:ascii="Times New Roman" w:hAnsi="Times New Roman" w:cs="Times New Roman"/>
-          <w:sz w:val="24"/>
-          <w:szCs w:val="24"/>
-        </w:rPr>
-      </w:pPr>
-    </w:p>
-    <w:p>
-      <w:pPr>
-        <w:jc w:val="both"/>
-        <w:rPr>
-          <w:rFonts w:ascii="Times New Roman" w:hAnsi="Times New Roman" w:cs="Times New Roman"/>
-          <w:sz w:val="24"/>
-          <w:szCs w:val="24"/>
-        </w:rPr>
-      </w:pPr>
-    </w:p>
-    <w:p>
-      <w:pPr>
-        <w:jc w:val="both"/>
-        <w:rPr>
-          <w:rFonts w:ascii="Times New Roman" w:hAnsi="Times New Roman" w:cs="Times New Roman"/>
-          <w:sz w:val="24"/>
-          <w:szCs w:val="24"/>
-        </w:rPr>
-      </w:pPr>
-    </w:p>
-    <w:p>
-      <w:pPr>
-        <w:jc w:val="both"/>
+        <w:rPr>
+          <w:rFonts w:ascii="Times New Roman" w:hAnsi="Times New Roman" w:cs="Times New Roman"/>
+          <w:sz w:val="24"/>
+          <w:szCs w:val="24"/>
+        </w:rPr>
+      </w:pPr>
+    </w:p>
+    <w:p>
+      <w:pPr>
+        <w:rPr>
+          <w:rFonts w:ascii="Times New Roman" w:hAnsi="Times New Roman" w:cs="Times New Roman"/>
+          <w:sz w:val="24"/>
+          <w:szCs w:val="24"/>
+        </w:rPr>
+      </w:pPr>
+    </w:p>
+    <w:p>
+      <w:pPr>
+        <w:rPr>
+          <w:rFonts w:ascii="Times New Roman" w:hAnsi="Times New Roman" w:cs="Times New Roman"/>
+          <w:sz w:val="24"/>
+          <w:szCs w:val="24"/>
+        </w:rPr>
+      </w:pPr>
+    </w:p>
+    <w:p>
+      <w:pPr>
+        <w:rPr>
+          <w:rFonts w:ascii="Times New Roman" w:hAnsi="Times New Roman" w:cs="Times New Roman"/>
+          <w:sz w:val="24"/>
+          <w:szCs w:val="24"/>
+        </w:rPr>
+      </w:pPr>
+    </w:p>
+    <w:p>
+      <w:pPr>
+        <w:rPr>
+          <w:rFonts w:ascii="Times New Roman" w:hAnsi="Times New Roman" w:cs="Times New Roman"/>
+          <w:sz w:val="24"/>
+          <w:szCs w:val="24"/>
+        </w:rPr>
+      </w:pPr>
+    </w:p>
+    <w:p>
+      <w:pPr>
+        <w:rPr>
+          <w:rFonts w:ascii="Times New Roman" w:hAnsi="Times New Roman" w:cs="Times New Roman"/>
+          <w:sz w:val="24"/>
+          <w:szCs w:val="24"/>
+        </w:rPr>
+      </w:pPr>
+    </w:p>
+    <w:p>
+      <w:pPr>
+        <w:rPr>
+          <w:rFonts w:ascii="Times New Roman" w:hAnsi="Times New Roman" w:cs="Times New Roman"/>
+          <w:sz w:val="24"/>
+          <w:szCs w:val="24"/>
+        </w:rPr>
+      </w:pPr>
+    </w:p>
+    <w:p>
+      <w:pPr>
+        <w:rPr>
+          <w:rFonts w:ascii="Times New Roman" w:hAnsi="Times New Roman" w:cs="Times New Roman"/>
+          <w:sz w:val="24"/>
+          <w:szCs w:val="24"/>
+        </w:rPr>
+      </w:pPr>
+    </w:p>
+    <w:p>
+      <w:pPr>
+        <w:rPr>
+          <w:rFonts w:ascii="Times New Roman" w:hAnsi="Times New Roman" w:cs="Times New Roman"/>
+          <w:sz w:val="24"/>
+          <w:szCs w:val="24"/>
+        </w:rPr>
+      </w:pPr>
+    </w:p>
+    <w:p>
+      <w:pPr>
+        <w:rPr>
+          <w:rFonts w:ascii="Times New Roman" w:hAnsi="Times New Roman" w:cs="Times New Roman"/>
+          <w:sz w:val="24"/>
+          <w:szCs w:val="24"/>
+        </w:rPr>
+      </w:pPr>
+    </w:p>
+    <w:p>
+      <w:pPr>
+        <w:rPr>
+          <w:rFonts w:ascii="Times New Roman" w:hAnsi="Times New Roman" w:cs="Times New Roman"/>
+          <w:sz w:val="24"/>
+          <w:szCs w:val="24"/>
+        </w:rPr>
+      </w:pPr>
+    </w:p>
+    <w:p>
+      <w:pPr>
+        <w:rPr>
+          <w:rFonts w:ascii="Times New Roman" w:hAnsi="Times New Roman" w:cs="Times New Roman"/>
+          <w:sz w:val="24"/>
+          <w:szCs w:val="24"/>
+        </w:rPr>
+      </w:pPr>
+    </w:p>
+    <w:p>
+      <w:pPr>
+        <w:rPr>
+          <w:rFonts w:ascii="Times New Roman" w:hAnsi="Times New Roman" w:cs="Times New Roman"/>
+          <w:sz w:val="24"/>
+          <w:szCs w:val="24"/>
+        </w:rPr>
+      </w:pPr>
+    </w:p>
+    <w:p>
+      <w:pPr>
+        <w:rPr>
+          <w:rFonts w:ascii="Times New Roman" w:hAnsi="Times New Roman" w:cs="Times New Roman"/>
+          <w:sz w:val="24"/>
+          <w:szCs w:val="24"/>
+        </w:rPr>
+      </w:pPr>
+    </w:p>
+    <w:p>
+      <w:pPr>
+        <w:rPr>
+          <w:rFonts w:ascii="Times New Roman" w:hAnsi="Times New Roman" w:cs="Times New Roman"/>
+          <w:sz w:val="24"/>
+          <w:szCs w:val="24"/>
+        </w:rPr>
+      </w:pPr>
+    </w:p>
+    <w:p>
+      <w:pPr>
+        <w:rPr>
+          <w:rFonts w:ascii="Times New Roman" w:hAnsi="Times New Roman" w:cs="Times New Roman"/>
+          <w:sz w:val="24"/>
+          <w:szCs w:val="24"/>
+        </w:rPr>
+      </w:pPr>
+    </w:p>
+    <w:p>
+      <w:pPr>
+        <w:rPr>
+          <w:rFonts w:ascii="Times New Roman" w:hAnsi="Times New Roman" w:cs="Times New Roman"/>
+          <w:sz w:val="24"/>
+          <w:szCs w:val="24"/>
+        </w:rPr>
+      </w:pPr>
+    </w:p>
+    <w:p>
+      <w:pPr>
+        <w:rPr>
+          <w:rFonts w:ascii="Times New Roman" w:hAnsi="Times New Roman" w:cs="Times New Roman"/>
+          <w:sz w:val="24"/>
+          <w:szCs w:val="24"/>
+        </w:rPr>
+      </w:pPr>
+    </w:p>
+    <w:p>
+      <w:pPr>
+        <w:rPr>
+          <w:rFonts w:ascii="Times New Roman" w:hAnsi="Times New Roman" w:cs="Times New Roman"/>
+          <w:sz w:val="24"/>
+          <w:szCs w:val="24"/>
+        </w:rPr>
+      </w:pPr>
+    </w:p>
+    <w:p>
+      <w:pPr>
+        <w:rPr>
+          <w:rFonts w:ascii="Times New Roman" w:hAnsi="Times New Roman" w:cs="Times New Roman"/>
+          <w:sz w:val="24"/>
+          <w:szCs w:val="24"/>
+        </w:rPr>
+      </w:pPr>
+    </w:p>
+    <w:p>
+      <w:pPr>
         <w:rPr>
           <w:rFonts w:ascii="Times New Roman" w:hAnsi="Times New Roman" w:cs="Times New Roman"/>
           <w:b/>
@@ -407,7 +381,6 @@
     </w:p>
     <w:p>
       <w:pPr>
-        <w:jc w:val="both"/>
         <w:rPr>
           <w:rFonts w:ascii="Times New Roman" w:hAnsi="Times New Roman" w:cs="Times New Roman"/>
           <w:sz w:val="24"/>
@@ -434,17 +407,15 @@
     </w:p>
     <w:p>
       <w:pPr>
-        <w:jc w:val="both"/>
-        <w:rPr>
-          <w:rFonts w:ascii="Times New Roman" w:hAnsi="Times New Roman" w:cs="Times New Roman"/>
-          <w:sz w:val="24"/>
-          <w:szCs w:val="24"/>
-        </w:rPr>
-      </w:pPr>
-    </w:p>
-    <w:p>
-      <w:pPr>
-        <w:jc w:val="both"/>
+        <w:rPr>
+          <w:rFonts w:ascii="Times New Roman" w:hAnsi="Times New Roman" w:cs="Times New Roman"/>
+          <w:sz w:val="24"/>
+          <w:szCs w:val="24"/>
+        </w:rPr>
+      </w:pPr>
+    </w:p>
+    <w:p>
+      <w:pPr>
         <w:rPr>
           <w:rFonts w:ascii="Times New Roman" w:hAnsi="Times New Roman" w:cs="Times New Roman"/>
           <w:sz w:val="24"/>
@@ -462,7 +433,6 @@
     </w:p>
     <w:p>
       <w:pPr>
-        <w:jc w:val="both"/>
         <w:rPr>
           <w:rFonts w:ascii="Times New Roman" w:hAnsi="Times New Roman" w:cs="Times New Roman"/>
           <w:sz w:val="24"/>
@@ -480,7 +450,6 @@
     </w:p>
     <w:p>
       <w:pPr>
-        <w:jc w:val="both"/>
         <w:rPr>
           <w:rFonts w:ascii="Times New Roman" w:hAnsi="Times New Roman" w:cs="Times New Roman"/>
           <w:sz w:val="24"/>
@@ -498,17 +467,15 @@
     </w:p>
     <w:p>
       <w:pPr>
-        <w:jc w:val="both"/>
-        <w:rPr>
-          <w:rFonts w:ascii="Times New Roman" w:hAnsi="Times New Roman" w:cs="Times New Roman"/>
-          <w:sz w:val="24"/>
-          <w:szCs w:val="24"/>
-        </w:rPr>
-      </w:pPr>
-    </w:p>
-    <w:p>
-      <w:pPr>
-        <w:jc w:val="both"/>
+        <w:rPr>
+          <w:rFonts w:ascii="Times New Roman" w:hAnsi="Times New Roman" w:cs="Times New Roman"/>
+          <w:sz w:val="24"/>
+          <w:szCs w:val="24"/>
+        </w:rPr>
+      </w:pPr>
+    </w:p>
+    <w:p>
+      <w:pPr>
         <w:rPr>
           <w:rFonts w:ascii="Times New Roman" w:hAnsi="Times New Roman" w:cs="Times New Roman"/>
           <w:sz w:val="24"/>
@@ -526,7 +493,6 @@
     </w:p>
     <w:p>
       <w:pPr>
-        <w:jc w:val="both"/>
         <w:rPr>
           <w:rFonts w:ascii="Times New Roman" w:hAnsi="Times New Roman" w:cs="Times New Roman"/>
           <w:sz w:val="24"/>
@@ -544,7 +510,6 @@
     </w:p>
     <w:p>
       <w:pPr>
-        <w:jc w:val="both"/>
         <w:rPr>
           <w:rFonts w:ascii="Times New Roman" w:hAnsi="Times New Roman" w:cs="Times New Roman"/>
           <w:sz w:val="24"/>
@@ -562,67 +527,60 @@
     </w:p>
     <w:p>
       <w:pPr>
-        <w:jc w:val="both"/>
-        <w:rPr>
-          <w:rFonts w:ascii="Times New Roman" w:hAnsi="Times New Roman" w:cs="Times New Roman"/>
-          <w:sz w:val="24"/>
-          <w:szCs w:val="24"/>
-        </w:rPr>
-      </w:pPr>
-    </w:p>
-    <w:p>
-      <w:pPr>
-        <w:jc w:val="both"/>
-        <w:rPr>
-          <w:rFonts w:ascii="Times New Roman" w:hAnsi="Times New Roman" w:cs="Times New Roman"/>
-          <w:sz w:val="24"/>
-          <w:szCs w:val="24"/>
-        </w:rPr>
-      </w:pPr>
-    </w:p>
-    <w:p>
-      <w:pPr>
-        <w:jc w:val="both"/>
-        <w:rPr>
-          <w:rFonts w:ascii="Times New Roman" w:hAnsi="Times New Roman" w:cs="Times New Roman"/>
-          <w:sz w:val="24"/>
-          <w:szCs w:val="24"/>
-        </w:rPr>
-      </w:pPr>
-    </w:p>
-    <w:p>
-      <w:pPr>
-        <w:jc w:val="both"/>
-        <w:rPr>
-          <w:rFonts w:ascii="Times New Roman" w:hAnsi="Times New Roman" w:cs="Times New Roman"/>
-          <w:sz w:val="24"/>
-          <w:szCs w:val="24"/>
-        </w:rPr>
-      </w:pPr>
-    </w:p>
-    <w:p>
-      <w:pPr>
-        <w:jc w:val="both"/>
-        <w:rPr>
-          <w:rFonts w:ascii="Times New Roman" w:hAnsi="Times New Roman" w:cs="Times New Roman"/>
-          <w:sz w:val="24"/>
-          <w:szCs w:val="24"/>
-        </w:rPr>
-      </w:pPr>
-    </w:p>
-    <w:p>
-      <w:pPr>
-        <w:jc w:val="both"/>
-        <w:rPr>
-          <w:rFonts w:ascii="Times New Roman" w:hAnsi="Times New Roman" w:cs="Times New Roman"/>
-          <w:sz w:val="24"/>
-          <w:szCs w:val="24"/>
-        </w:rPr>
-      </w:pPr>
-    </w:p>
-    <w:p>
-      <w:pPr>
-        <w:jc w:val="both"/>
+        <w:rPr>
+          <w:rFonts w:ascii="Times New Roman" w:hAnsi="Times New Roman" w:cs="Times New Roman"/>
+          <w:sz w:val="24"/>
+          <w:szCs w:val="24"/>
+        </w:rPr>
+      </w:pPr>
+    </w:p>
+    <w:p>
+      <w:pPr>
+        <w:rPr>
+          <w:rFonts w:ascii="Times New Roman" w:hAnsi="Times New Roman" w:cs="Times New Roman"/>
+          <w:sz w:val="24"/>
+          <w:szCs w:val="24"/>
+        </w:rPr>
+      </w:pPr>
+    </w:p>
+    <w:p>
+      <w:pPr>
+        <w:rPr>
+          <w:rFonts w:ascii="Times New Roman" w:hAnsi="Times New Roman" w:cs="Times New Roman"/>
+          <w:sz w:val="24"/>
+          <w:szCs w:val="24"/>
+        </w:rPr>
+      </w:pPr>
+    </w:p>
+    <w:p>
+      <w:pPr>
+        <w:rPr>
+          <w:rFonts w:ascii="Times New Roman" w:hAnsi="Times New Roman" w:cs="Times New Roman"/>
+          <w:sz w:val="24"/>
+          <w:szCs w:val="24"/>
+        </w:rPr>
+      </w:pPr>
+    </w:p>
+    <w:p>
+      <w:pPr>
+        <w:rPr>
+          <w:rFonts w:ascii="Times New Roman" w:hAnsi="Times New Roman" w:cs="Times New Roman"/>
+          <w:sz w:val="24"/>
+          <w:szCs w:val="24"/>
+        </w:rPr>
+      </w:pPr>
+    </w:p>
+    <w:p>
+      <w:pPr>
+        <w:rPr>
+          <w:rFonts w:ascii="Times New Roman" w:hAnsi="Times New Roman" w:cs="Times New Roman"/>
+          <w:sz w:val="24"/>
+          <w:szCs w:val="24"/>
+        </w:rPr>
+      </w:pPr>
+    </w:p>
+    <w:p>
+      <w:pPr>
         <w:rPr>
           <w:rFonts w:ascii="Times New Roman" w:hAnsi="Times New Roman" w:cs="Times New Roman"/>
           <w:b/>
@@ -635,7 +593,6 @@
     </w:p>
     <w:p>
       <w:pPr>
-        <w:jc w:val="both"/>
         <w:rPr>
           <w:rFonts w:ascii="Times New Roman" w:hAnsi="Times New Roman" w:cs="Times New Roman"/>
           <w:b/>
@@ -648,7 +605,6 @@
     </w:p>
     <w:p>
       <w:pPr>
-        <w:jc w:val="both"/>
         <w:rPr>
           <w:rFonts w:ascii="Times New Roman" w:hAnsi="Times New Roman" w:cs="Times New Roman"/>
           <w:b/>
@@ -661,7 +617,6 @@
     </w:p>
     <w:p>
       <w:pPr>
-        <w:jc w:val="both"/>
         <w:rPr>
           <w:rFonts w:ascii="Times New Roman" w:hAnsi="Times New Roman" w:cs="Times New Roman"/>
           <w:b/>
@@ -674,7 +629,6 @@
     </w:p>
     <w:p>
       <w:pPr>
-        <w:jc w:val="both"/>
         <w:rPr>
           <w:rFonts w:ascii="Times New Roman" w:hAnsi="Times New Roman" w:cs="Times New Roman"/>
           <w:b/>
@@ -687,7 +641,6 @@
     </w:p>
     <w:p>
       <w:pPr>
-        <w:jc w:val="both"/>
         <w:rPr>
           <w:rFonts w:ascii="Times New Roman" w:hAnsi="Times New Roman" w:cs="Times New Roman"/>
           <w:b/>
@@ -700,7 +653,6 @@
     </w:p>
     <w:p>
       <w:pPr>
-        <w:jc w:val="both"/>
         <w:rPr>
           <w:rFonts w:ascii="Times New Roman" w:hAnsi="Times New Roman" w:cs="Times New Roman"/>
           <w:b/>
@@ -725,7 +677,6 @@
     </w:p>
     <w:p>
       <w:pPr>
-        <w:jc w:val="both"/>
         <w:rPr>
           <w:rFonts w:ascii="Times New Roman" w:hAnsi="Times New Roman" w:cs="Times New Roman"/>
           <w:sz w:val="24"/>
@@ -743,7 +694,6 @@
     </w:p>
     <w:p>
       <w:pPr>
-        <w:jc w:val="both"/>
         <w:rPr>
           <w:rFonts w:ascii="Times New Roman" w:hAnsi="Times New Roman" w:cs="Times New Roman"/>
           <w:sz w:val="24"/>
@@ -761,17 +711,15 @@
     </w:p>
     <w:p>
       <w:pPr>
-        <w:jc w:val="both"/>
-        <w:rPr>
-          <w:rFonts w:ascii="Times New Roman" w:hAnsi="Times New Roman" w:cs="Times New Roman"/>
-          <w:sz w:val="24"/>
-          <w:szCs w:val="24"/>
-        </w:rPr>
-      </w:pPr>
-    </w:p>
-    <w:p>
-      <w:pPr>
-        <w:jc w:val="both"/>
+        <w:rPr>
+          <w:rFonts w:ascii="Times New Roman" w:hAnsi="Times New Roman" w:cs="Times New Roman"/>
+          <w:sz w:val="24"/>
+          <w:szCs w:val="24"/>
+        </w:rPr>
+      </w:pPr>
+    </w:p>
+    <w:p>
+      <w:pPr>
         <w:rPr>
           <w:rFonts w:ascii="Times New Roman" w:hAnsi="Times New Roman" w:cs="Times New Roman"/>
           <w:sz w:val="24"/>
@@ -789,7 +737,6 @@
     </w:p>
     <w:p>
       <w:pPr>
-        <w:jc w:val="both"/>
         <w:rPr>
           <w:rFonts w:ascii="Times New Roman" w:hAnsi="Times New Roman" w:cs="Times New Roman"/>
           <w:sz w:val="24"/>
@@ -807,7 +754,6 @@
     </w:p>
     <w:p>
       <w:pPr>
-        <w:jc w:val="both"/>
         <w:rPr>
           <w:rFonts w:ascii="Times New Roman" w:hAnsi="Times New Roman" w:cs="Times New Roman"/>
           <w:sz w:val="24"/>
@@ -825,17 +771,15 @@
     </w:p>
     <w:p>
       <w:pPr>
-        <w:jc w:val="both"/>
-        <w:rPr>
-          <w:rFonts w:ascii="Times New Roman" w:hAnsi="Times New Roman" w:cs="Times New Roman"/>
-          <w:sz w:val="24"/>
-          <w:szCs w:val="24"/>
-        </w:rPr>
-      </w:pPr>
-    </w:p>
-    <w:p>
-      <w:pPr>
-        <w:jc w:val="both"/>
+        <w:rPr>
+          <w:rFonts w:ascii="Times New Roman" w:hAnsi="Times New Roman" w:cs="Times New Roman"/>
+          <w:sz w:val="24"/>
+          <w:szCs w:val="24"/>
+        </w:rPr>
+      </w:pPr>
+    </w:p>
+    <w:p>
+      <w:pPr>
         <w:rPr>
           <w:rFonts w:ascii="Times New Roman" w:hAnsi="Times New Roman" w:cs="Times New Roman"/>
           <w:sz w:val="24"/>
@@ -862,7 +806,6 @@
     </w:p>
     <w:p>
       <w:pPr>
-        <w:jc w:val="both"/>
         <w:rPr>
           <w:rFonts w:ascii="Times New Roman" w:hAnsi="Times New Roman" w:cs="Times New Roman"/>
           <w:sz w:val="24"/>
@@ -880,127 +823,114 @@
     </w:p>
     <w:p>
       <w:pPr>
-        <w:jc w:val="both"/>
-        <w:rPr>
-          <w:rFonts w:ascii="Times New Roman" w:hAnsi="Times New Roman" w:cs="Times New Roman"/>
-          <w:sz w:val="24"/>
-          <w:szCs w:val="24"/>
-        </w:rPr>
-      </w:pPr>
-    </w:p>
-    <w:p>
-      <w:pPr>
-        <w:jc w:val="both"/>
-        <w:rPr>
-          <w:rFonts w:ascii="Times New Roman" w:hAnsi="Times New Roman" w:cs="Times New Roman"/>
-          <w:sz w:val="24"/>
-          <w:szCs w:val="24"/>
-        </w:rPr>
-      </w:pPr>
-    </w:p>
-    <w:p>
-      <w:pPr>
-        <w:jc w:val="both"/>
-        <w:rPr>
-          <w:rFonts w:ascii="Times New Roman" w:hAnsi="Times New Roman" w:cs="Times New Roman"/>
-          <w:sz w:val="24"/>
-          <w:szCs w:val="24"/>
-        </w:rPr>
-      </w:pPr>
-    </w:p>
-    <w:p>
-      <w:pPr>
-        <w:jc w:val="both"/>
-        <w:rPr>
-          <w:rFonts w:ascii="Times New Roman" w:hAnsi="Times New Roman" w:cs="Times New Roman"/>
-          <w:sz w:val="24"/>
-          <w:szCs w:val="24"/>
-        </w:rPr>
-      </w:pPr>
-    </w:p>
-    <w:p>
-      <w:pPr>
-        <w:jc w:val="both"/>
-        <w:rPr>
-          <w:rFonts w:ascii="Times New Roman" w:hAnsi="Times New Roman" w:cs="Times New Roman"/>
-          <w:sz w:val="24"/>
-          <w:szCs w:val="24"/>
-        </w:rPr>
-      </w:pPr>
-    </w:p>
-    <w:p>
-      <w:pPr>
-        <w:jc w:val="both"/>
-        <w:rPr>
-          <w:rFonts w:ascii="Times New Roman" w:hAnsi="Times New Roman" w:cs="Times New Roman"/>
-          <w:sz w:val="24"/>
-          <w:szCs w:val="24"/>
-        </w:rPr>
-      </w:pPr>
-    </w:p>
-    <w:p>
-      <w:pPr>
-        <w:jc w:val="both"/>
-        <w:rPr>
-          <w:rFonts w:ascii="Times New Roman" w:hAnsi="Times New Roman" w:cs="Times New Roman"/>
-          <w:sz w:val="24"/>
-          <w:szCs w:val="24"/>
-        </w:rPr>
-      </w:pPr>
-    </w:p>
-    <w:p>
-      <w:pPr>
-        <w:jc w:val="both"/>
-        <w:rPr>
-          <w:rFonts w:ascii="Times New Roman" w:hAnsi="Times New Roman" w:cs="Times New Roman"/>
-          <w:sz w:val="24"/>
-          <w:szCs w:val="24"/>
-        </w:rPr>
-      </w:pPr>
-    </w:p>
-    <w:p>
-      <w:pPr>
-        <w:jc w:val="both"/>
-        <w:rPr>
-          <w:rFonts w:ascii="Times New Roman" w:hAnsi="Times New Roman" w:cs="Times New Roman"/>
-          <w:sz w:val="24"/>
-          <w:szCs w:val="24"/>
-        </w:rPr>
-      </w:pPr>
-    </w:p>
-    <w:p>
-      <w:pPr>
-        <w:jc w:val="both"/>
-        <w:rPr>
-          <w:rFonts w:ascii="Times New Roman" w:hAnsi="Times New Roman" w:cs="Times New Roman"/>
-          <w:sz w:val="24"/>
-          <w:szCs w:val="24"/>
-        </w:rPr>
-      </w:pPr>
-    </w:p>
-    <w:p>
-      <w:pPr>
-        <w:jc w:val="both"/>
-        <w:rPr>
-          <w:rFonts w:ascii="Times New Roman" w:hAnsi="Times New Roman" w:cs="Times New Roman"/>
-          <w:sz w:val="24"/>
-          <w:szCs w:val="24"/>
-        </w:rPr>
-      </w:pPr>
-    </w:p>
-    <w:p>
-      <w:pPr>
-        <w:jc w:val="both"/>
-        <w:rPr>
-          <w:rFonts w:ascii="Times New Roman" w:hAnsi="Times New Roman" w:cs="Times New Roman"/>
-          <w:sz w:val="24"/>
-          <w:szCs w:val="24"/>
-        </w:rPr>
-      </w:pPr>
-    </w:p>
-    <w:p>
-      <w:pPr>
-        <w:jc w:val="both"/>
+        <w:rPr>
+          <w:rFonts w:ascii="Times New Roman" w:hAnsi="Times New Roman" w:cs="Times New Roman"/>
+          <w:sz w:val="24"/>
+          <w:szCs w:val="24"/>
+        </w:rPr>
+      </w:pPr>
+    </w:p>
+    <w:p>
+      <w:pPr>
+        <w:rPr>
+          <w:rFonts w:ascii="Times New Roman" w:hAnsi="Times New Roman" w:cs="Times New Roman"/>
+          <w:sz w:val="24"/>
+          <w:szCs w:val="24"/>
+        </w:rPr>
+      </w:pPr>
+    </w:p>
+    <w:p>
+      <w:pPr>
+        <w:rPr>
+          <w:rFonts w:ascii="Times New Roman" w:hAnsi="Times New Roman" w:cs="Times New Roman"/>
+          <w:sz w:val="24"/>
+          <w:szCs w:val="24"/>
+        </w:rPr>
+      </w:pPr>
+    </w:p>
+    <w:p>
+      <w:pPr>
+        <w:rPr>
+          <w:rFonts w:ascii="Times New Roman" w:hAnsi="Times New Roman" w:cs="Times New Roman"/>
+          <w:sz w:val="24"/>
+          <w:szCs w:val="24"/>
+        </w:rPr>
+      </w:pPr>
+    </w:p>
+    <w:p>
+      <w:pPr>
+        <w:rPr>
+          <w:rFonts w:ascii="Times New Roman" w:hAnsi="Times New Roman" w:cs="Times New Roman"/>
+          <w:sz w:val="24"/>
+          <w:szCs w:val="24"/>
+        </w:rPr>
+      </w:pPr>
+    </w:p>
+    <w:p>
+      <w:pPr>
+        <w:rPr>
+          <w:rFonts w:ascii="Times New Roman" w:hAnsi="Times New Roman" w:cs="Times New Roman"/>
+          <w:sz w:val="24"/>
+          <w:szCs w:val="24"/>
+        </w:rPr>
+      </w:pPr>
+    </w:p>
+    <w:p>
+      <w:pPr>
+        <w:rPr>
+          <w:rFonts w:ascii="Times New Roman" w:hAnsi="Times New Roman" w:cs="Times New Roman"/>
+          <w:sz w:val="24"/>
+          <w:szCs w:val="24"/>
+        </w:rPr>
+      </w:pPr>
+    </w:p>
+    <w:p>
+      <w:pPr>
+        <w:rPr>
+          <w:rFonts w:ascii="Times New Roman" w:hAnsi="Times New Roman" w:cs="Times New Roman"/>
+          <w:sz w:val="24"/>
+          <w:szCs w:val="24"/>
+        </w:rPr>
+      </w:pPr>
+    </w:p>
+    <w:p>
+      <w:pPr>
+        <w:rPr>
+          <w:rFonts w:ascii="Times New Roman" w:hAnsi="Times New Roman" w:cs="Times New Roman"/>
+          <w:sz w:val="24"/>
+          <w:szCs w:val="24"/>
+        </w:rPr>
+      </w:pPr>
+    </w:p>
+    <w:p>
+      <w:pPr>
+        <w:rPr>
+          <w:rFonts w:ascii="Times New Roman" w:hAnsi="Times New Roman" w:cs="Times New Roman"/>
+          <w:sz w:val="24"/>
+          <w:szCs w:val="24"/>
+        </w:rPr>
+      </w:pPr>
+    </w:p>
+    <w:p>
+      <w:pPr>
+        <w:rPr>
+          <w:rFonts w:ascii="Times New Roman" w:hAnsi="Times New Roman" w:cs="Times New Roman"/>
+          <w:sz w:val="24"/>
+          <w:szCs w:val="24"/>
+        </w:rPr>
+      </w:pPr>
+    </w:p>
+    <w:p>
+      <w:pPr>
+        <w:rPr>
+          <w:rFonts w:ascii="Times New Roman" w:hAnsi="Times New Roman" w:cs="Times New Roman"/>
+          <w:sz w:val="24"/>
+          <w:szCs w:val="24"/>
+        </w:rPr>
+      </w:pPr>
+    </w:p>
+    <w:p>
+      <w:pPr>
         <w:rPr>
           <w:rFonts w:ascii="Times New Roman" w:hAnsi="Times New Roman" w:cs="Times New Roman"/>
           <w:b/>
@@ -1025,7 +955,6 @@
     </w:p>
     <w:p>
       <w:pPr>
-        <w:jc w:val="both"/>
         <w:rPr>
           <w:rFonts w:ascii="Times New Roman" w:hAnsi="Times New Roman" w:cs="Times New Roman"/>
           <w:sz w:val="24"/>
@@ -1052,17 +981,15 @@
     </w:p>
     <w:p>
       <w:pPr>
-        <w:jc w:val="both"/>
-        <w:rPr>
-          <w:rFonts w:ascii="Times New Roman" w:hAnsi="Times New Roman" w:cs="Times New Roman"/>
-          <w:sz w:val="24"/>
-          <w:szCs w:val="24"/>
-        </w:rPr>
-      </w:pPr>
-    </w:p>
-    <w:p>
-      <w:pPr>
-        <w:jc w:val="both"/>
+        <w:rPr>
+          <w:rFonts w:ascii="Times New Roman" w:hAnsi="Times New Roman" w:cs="Times New Roman"/>
+          <w:sz w:val="24"/>
+          <w:szCs w:val="24"/>
+        </w:rPr>
+      </w:pPr>
+    </w:p>
+    <w:p>
+      <w:pPr>
         <w:rPr>
           <w:rFonts w:ascii="Times New Roman" w:hAnsi="Times New Roman" w:cs="Times New Roman"/>
           <w:sz w:val="24"/>
@@ -1089,7 +1016,6 @@
     </w:p>
     <w:p>
       <w:pPr>
-        <w:jc w:val="both"/>
         <w:rPr>
           <w:rFonts w:ascii="Times New Roman" w:hAnsi="Times New Roman" w:cs="Times New Roman"/>
           <w:sz w:val="24"/>
@@ -1107,17 +1033,15 @@
     </w:p>
     <w:p>
       <w:pPr>
-        <w:jc w:val="both"/>
-        <w:rPr>
-          <w:rFonts w:ascii="Times New Roman" w:hAnsi="Times New Roman" w:cs="Times New Roman"/>
-          <w:sz w:val="24"/>
-          <w:szCs w:val="24"/>
-        </w:rPr>
-      </w:pPr>
-    </w:p>
-    <w:p>
-      <w:pPr>
-        <w:jc w:val="both"/>
+        <w:rPr>
+          <w:rFonts w:ascii="Times New Roman" w:hAnsi="Times New Roman" w:cs="Times New Roman"/>
+          <w:sz w:val="24"/>
+          <w:szCs w:val="24"/>
+        </w:rPr>
+      </w:pPr>
+    </w:p>
+    <w:p>
+      <w:pPr>
         <w:rPr>
           <w:rFonts w:ascii="Times New Roman" w:hAnsi="Times New Roman" w:cs="Times New Roman"/>
           <w:sz w:val="24"/>
@@ -1144,7 +1068,6 @@
     </w:p>
     <w:p>
       <w:pPr>
-        <w:jc w:val="both"/>
         <w:rPr>
           <w:rFonts w:ascii="Times New Roman" w:hAnsi="Times New Roman" w:cs="Times New Roman"/>
           <w:sz w:val="24"/>
@@ -1162,147 +1085,132 @@
     </w:p>
     <w:p>
       <w:pPr>
-        <w:jc w:val="both"/>
-        <w:rPr>
-          <w:rFonts w:ascii="Times New Roman" w:hAnsi="Times New Roman" w:cs="Times New Roman"/>
-          <w:sz w:val="24"/>
-          <w:szCs w:val="24"/>
-        </w:rPr>
-      </w:pPr>
-    </w:p>
-    <w:p>
-      <w:pPr>
-        <w:jc w:val="both"/>
-        <w:rPr>
-          <w:rFonts w:ascii="Times New Roman" w:hAnsi="Times New Roman" w:cs="Times New Roman"/>
-          <w:sz w:val="24"/>
-          <w:szCs w:val="24"/>
-        </w:rPr>
-      </w:pPr>
-    </w:p>
-    <w:p>
-      <w:pPr>
-        <w:jc w:val="both"/>
-        <w:rPr>
-          <w:rFonts w:ascii="Times New Roman" w:hAnsi="Times New Roman" w:cs="Times New Roman"/>
-          <w:sz w:val="24"/>
-          <w:szCs w:val="24"/>
-        </w:rPr>
-      </w:pPr>
-    </w:p>
-    <w:p>
-      <w:pPr>
-        <w:jc w:val="both"/>
-        <w:rPr>
-          <w:rFonts w:ascii="Times New Roman" w:hAnsi="Times New Roman" w:cs="Times New Roman"/>
-          <w:sz w:val="24"/>
-          <w:szCs w:val="24"/>
-        </w:rPr>
-      </w:pPr>
-    </w:p>
-    <w:p>
-      <w:pPr>
-        <w:jc w:val="both"/>
-        <w:rPr>
-          <w:rFonts w:ascii="Times New Roman" w:hAnsi="Times New Roman" w:cs="Times New Roman"/>
-          <w:sz w:val="24"/>
-          <w:szCs w:val="24"/>
-        </w:rPr>
-      </w:pPr>
-    </w:p>
-    <w:p>
-      <w:pPr>
-        <w:jc w:val="both"/>
-        <w:rPr>
-          <w:rFonts w:ascii="Times New Roman" w:hAnsi="Times New Roman" w:cs="Times New Roman"/>
-          <w:sz w:val="24"/>
-          <w:szCs w:val="24"/>
-        </w:rPr>
-      </w:pPr>
-    </w:p>
-    <w:p>
-      <w:pPr>
-        <w:jc w:val="both"/>
-        <w:rPr>
-          <w:rFonts w:ascii="Times New Roman" w:hAnsi="Times New Roman" w:cs="Times New Roman"/>
-          <w:sz w:val="24"/>
-          <w:szCs w:val="24"/>
-        </w:rPr>
-      </w:pPr>
-    </w:p>
-    <w:p>
-      <w:pPr>
-        <w:jc w:val="both"/>
-        <w:rPr>
-          <w:rFonts w:ascii="Times New Roman" w:hAnsi="Times New Roman" w:cs="Times New Roman"/>
-          <w:sz w:val="24"/>
-          <w:szCs w:val="24"/>
-        </w:rPr>
-      </w:pPr>
-    </w:p>
-    <w:p>
-      <w:pPr>
-        <w:jc w:val="both"/>
-        <w:rPr>
-          <w:rFonts w:ascii="Times New Roman" w:hAnsi="Times New Roman" w:cs="Times New Roman"/>
-          <w:sz w:val="24"/>
-          <w:szCs w:val="24"/>
-        </w:rPr>
-      </w:pPr>
-    </w:p>
-    <w:p>
-      <w:pPr>
-        <w:jc w:val="both"/>
-        <w:rPr>
-          <w:rFonts w:ascii="Times New Roman" w:hAnsi="Times New Roman" w:cs="Times New Roman"/>
-          <w:sz w:val="24"/>
-          <w:szCs w:val="24"/>
-        </w:rPr>
-      </w:pPr>
-    </w:p>
-    <w:p>
-      <w:pPr>
-        <w:jc w:val="both"/>
-        <w:rPr>
-          <w:rFonts w:ascii="Times New Roman" w:hAnsi="Times New Roman" w:cs="Times New Roman"/>
-          <w:sz w:val="24"/>
-          <w:szCs w:val="24"/>
-        </w:rPr>
-      </w:pPr>
-    </w:p>
-    <w:p>
-      <w:pPr>
-        <w:jc w:val="both"/>
-        <w:rPr>
-          <w:rFonts w:ascii="Times New Roman" w:hAnsi="Times New Roman" w:cs="Times New Roman"/>
-          <w:sz w:val="24"/>
-          <w:szCs w:val="24"/>
-        </w:rPr>
-      </w:pPr>
-    </w:p>
-    <w:p>
-      <w:pPr>
-        <w:jc w:val="both"/>
-        <w:rPr>
-          <w:rFonts w:ascii="Times New Roman" w:hAnsi="Times New Roman" w:cs="Times New Roman"/>
-          <w:sz w:val="24"/>
-          <w:szCs w:val="24"/>
-        </w:rPr>
-      </w:pPr>
-    </w:p>
-    <w:p>
-      <w:pPr>
-        <w:jc w:val="both"/>
-        <w:rPr>
-          <w:rFonts w:ascii="Times New Roman" w:hAnsi="Times New Roman" w:cs="Times New Roman"/>
-          <w:sz w:val="24"/>
-          <w:szCs w:val="24"/>
-        </w:rPr>
-      </w:pPr>
-    </w:p>
-    <w:p>
-      <w:pPr>
-        <w:jc w:val="both"/>
+        <w:rPr>
+          <w:rFonts w:ascii="Times New Roman" w:hAnsi="Times New Roman" w:cs="Times New Roman"/>
+          <w:sz w:val="24"/>
+          <w:szCs w:val="24"/>
+        </w:rPr>
+      </w:pPr>
+    </w:p>
+    <w:p>
+      <w:pPr>
+        <w:rPr>
+          <w:rFonts w:ascii="Times New Roman" w:hAnsi="Times New Roman" w:cs="Times New Roman"/>
+          <w:sz w:val="24"/>
+          <w:szCs w:val="24"/>
+        </w:rPr>
+      </w:pPr>
+    </w:p>
+    <w:p>
+      <w:pPr>
+        <w:rPr>
+          <w:rFonts w:ascii="Times New Roman" w:hAnsi="Times New Roman" w:cs="Times New Roman"/>
+          <w:sz w:val="24"/>
+          <w:szCs w:val="24"/>
+        </w:rPr>
+      </w:pPr>
+    </w:p>
+    <w:p>
+      <w:pPr>
+        <w:rPr>
+          <w:rFonts w:ascii="Times New Roman" w:hAnsi="Times New Roman" w:cs="Times New Roman"/>
+          <w:sz w:val="24"/>
+          <w:szCs w:val="24"/>
+        </w:rPr>
+      </w:pPr>
+    </w:p>
+    <w:p>
+      <w:pPr>
+        <w:rPr>
+          <w:rFonts w:ascii="Times New Roman" w:hAnsi="Times New Roman" w:cs="Times New Roman"/>
+          <w:sz w:val="24"/>
+          <w:szCs w:val="24"/>
+        </w:rPr>
+      </w:pPr>
+    </w:p>
+    <w:p>
+      <w:pPr>
+        <w:rPr>
+          <w:rFonts w:ascii="Times New Roman" w:hAnsi="Times New Roman" w:cs="Times New Roman"/>
+          <w:sz w:val="24"/>
+          <w:szCs w:val="24"/>
+        </w:rPr>
+      </w:pPr>
+    </w:p>
+    <w:p>
+      <w:pPr>
+        <w:rPr>
+          <w:rFonts w:ascii="Times New Roman" w:hAnsi="Times New Roman" w:cs="Times New Roman"/>
+          <w:sz w:val="24"/>
+          <w:szCs w:val="24"/>
+        </w:rPr>
+      </w:pPr>
+    </w:p>
+    <w:p>
+      <w:pPr>
+        <w:rPr>
+          <w:rFonts w:ascii="Times New Roman" w:hAnsi="Times New Roman" w:cs="Times New Roman"/>
+          <w:sz w:val="24"/>
+          <w:szCs w:val="24"/>
+        </w:rPr>
+      </w:pPr>
+    </w:p>
+    <w:p>
+      <w:pPr>
+        <w:rPr>
+          <w:rFonts w:ascii="Times New Roman" w:hAnsi="Times New Roman" w:cs="Times New Roman"/>
+          <w:sz w:val="24"/>
+          <w:szCs w:val="24"/>
+        </w:rPr>
+      </w:pPr>
+    </w:p>
+    <w:p>
+      <w:pPr>
+        <w:rPr>
+          <w:rFonts w:ascii="Times New Roman" w:hAnsi="Times New Roman" w:cs="Times New Roman"/>
+          <w:sz w:val="24"/>
+          <w:szCs w:val="24"/>
+        </w:rPr>
+      </w:pPr>
+    </w:p>
+    <w:p>
+      <w:pPr>
+        <w:rPr>
+          <w:rFonts w:ascii="Times New Roman" w:hAnsi="Times New Roman" w:cs="Times New Roman"/>
+          <w:sz w:val="24"/>
+          <w:szCs w:val="24"/>
+        </w:rPr>
+      </w:pPr>
+    </w:p>
+    <w:p>
+      <w:pPr>
+        <w:rPr>
+          <w:rFonts w:ascii="Times New Roman" w:hAnsi="Times New Roman" w:cs="Times New Roman"/>
+          <w:sz w:val="24"/>
+          <w:szCs w:val="24"/>
+        </w:rPr>
+      </w:pPr>
+    </w:p>
+    <w:p>
+      <w:pPr>
+        <w:rPr>
+          <w:rFonts w:ascii="Times New Roman" w:hAnsi="Times New Roman" w:cs="Times New Roman"/>
+          <w:sz w:val="24"/>
+          <w:szCs w:val="24"/>
+        </w:rPr>
+      </w:pPr>
+    </w:p>
+    <w:p>
+      <w:pPr>
+        <w:rPr>
+          <w:rFonts w:ascii="Times New Roman" w:hAnsi="Times New Roman" w:cs="Times New Roman"/>
+          <w:sz w:val="24"/>
+          <w:szCs w:val="24"/>
+        </w:rPr>
+      </w:pPr>
+    </w:p>
+    <w:p>
+      <w:pPr>
         <w:rPr>
           <w:rFonts w:ascii="Times New Roman" w:hAnsi="Times New Roman" w:cs="Times New Roman"/>
           <w:b/>
@@ -1327,7 +1235,6 @@
     </w:p>
     <w:p>
       <w:pPr>
-        <w:jc w:val="both"/>
         <w:rPr>
           <w:rFonts w:ascii="Times New Roman" w:hAnsi="Times New Roman" w:cs="Times New Roman"/>
           <w:sz w:val="24"/>
@@ -1361,17 +1268,15 @@
     </w:p>
     <w:p>
       <w:pPr>
-        <w:jc w:val="both"/>
-        <w:rPr>
-          <w:rFonts w:ascii="Times New Roman" w:hAnsi="Times New Roman" w:cs="Times New Roman"/>
-          <w:sz w:val="24"/>
-          <w:szCs w:val="24"/>
-        </w:rPr>
-      </w:pPr>
-    </w:p>
-    <w:p>
-      <w:pPr>
-        <w:jc w:val="both"/>
+        <w:rPr>
+          <w:rFonts w:ascii="Times New Roman" w:hAnsi="Times New Roman" w:cs="Times New Roman"/>
+          <w:sz w:val="24"/>
+          <w:szCs w:val="24"/>
+        </w:rPr>
+      </w:pPr>
+    </w:p>
+    <w:p>
+      <w:pPr>
         <w:rPr>
           <w:rFonts w:ascii="Times New Roman" w:hAnsi="Times New Roman" w:cs="Times New Roman"/>
           <w:sz w:val="24"/>
@@ -1389,7 +1294,6 @@
     </w:p>
     <w:p>
       <w:pPr>
-        <w:jc w:val="both"/>
         <w:rPr>
           <w:rFonts w:ascii="Times New Roman" w:hAnsi="Times New Roman" w:cs="Times New Roman"/>
           <w:sz w:val="24"/>
@@ -1415,7 +1319,6 @@
     </w:p>
     <w:p>
       <w:pPr>
-        <w:jc w:val="both"/>
         <w:rPr>
           <w:rFonts w:ascii="Times New Roman" w:hAnsi="Times New Roman" w:cs="Times New Roman"/>
           <w:sz w:val="24"/>
@@ -1433,17 +1336,15 @@
     </w:p>
     <w:p>
       <w:pPr>
-        <w:jc w:val="both"/>
-        <w:rPr>
-          <w:rFonts w:ascii="Times New Roman" w:hAnsi="Times New Roman" w:cs="Times New Roman"/>
-          <w:sz w:val="24"/>
-          <w:szCs w:val="24"/>
-        </w:rPr>
-      </w:pPr>
-    </w:p>
-    <w:p>
-      <w:pPr>
-        <w:jc w:val="both"/>
+        <w:rPr>
+          <w:rFonts w:ascii="Times New Roman" w:hAnsi="Times New Roman" w:cs="Times New Roman"/>
+          <w:sz w:val="24"/>
+          <w:szCs w:val="24"/>
+        </w:rPr>
+      </w:pPr>
+    </w:p>
+    <w:p>
+      <w:pPr>
         <w:rPr>
           <w:rFonts w:ascii="Times New Roman" w:hAnsi="Times New Roman" w:cs="Times New Roman"/>
           <w:sz w:val="24"/>
@@ -1477,7 +1378,6 @@
     </w:p>
     <w:p>
       <w:pPr>
-        <w:jc w:val="both"/>
         <w:rPr>
           <w:rFonts w:ascii="Times New Roman" w:hAnsi="Times New Roman" w:cs="Times New Roman"/>
           <w:sz w:val="24"/>
@@ -1492,6 +1392,483 @@
         </w:rPr>
         <w:t>chmod +x dist/redact_pdf</w:t>
       </w:r>
+    </w:p>
+    <w:p>
+      <w:pPr>
+        <w:rPr>
+          <w:rFonts w:ascii="Times New Roman" w:hAnsi="Times New Roman" w:cs="Times New Roman"/>
+          <w:sz w:val="24"/>
+          <w:szCs w:val="24"/>
+        </w:rPr>
+      </w:pPr>
+    </w:p>
+    <w:p>
+      <w:pPr>
+        <w:rPr>
+          <w:rFonts w:ascii="Times New Roman" w:hAnsi="Times New Roman" w:cs="Times New Roman"/>
+          <w:sz w:val="24"/>
+          <w:szCs w:val="24"/>
+        </w:rPr>
+      </w:pPr>
+    </w:p>
+    <w:p>
+      <w:pPr>
+        <w:rPr>
+          <w:rFonts w:ascii="Times New Roman" w:hAnsi="Times New Roman" w:cs="Times New Roman"/>
+          <w:sz w:val="24"/>
+          <w:szCs w:val="24"/>
+        </w:rPr>
+      </w:pPr>
+    </w:p>
+    <w:p>
+      <w:pPr>
+        <w:rPr>
+          <w:rFonts w:ascii="Times New Roman" w:hAnsi="Times New Roman" w:cs="Times New Roman"/>
+          <w:sz w:val="24"/>
+          <w:szCs w:val="24"/>
+        </w:rPr>
+      </w:pPr>
+    </w:p>
+    <w:p>
+      <w:pPr>
+        <w:rPr>
+          <w:rFonts w:ascii="Times New Roman" w:hAnsi="Times New Roman" w:cs="Times New Roman"/>
+          <w:sz w:val="24"/>
+          <w:szCs w:val="24"/>
+        </w:rPr>
+      </w:pPr>
+    </w:p>
+    <w:p>
+      <w:pPr>
+        <w:rPr>
+          <w:rFonts w:ascii="Times New Roman" w:hAnsi="Times New Roman" w:cs="Times New Roman"/>
+          <w:sz w:val="24"/>
+          <w:szCs w:val="24"/>
+        </w:rPr>
+      </w:pPr>
+    </w:p>
+    <w:p>
+      <w:pPr>
+        <w:rPr>
+          <w:rFonts w:ascii="Times New Roman" w:hAnsi="Times New Roman" w:cs="Times New Roman"/>
+          <w:sz w:val="24"/>
+          <w:szCs w:val="24"/>
+        </w:rPr>
+      </w:pPr>
+    </w:p>
+    <w:p>
+      <w:pPr>
+        <w:rPr>
+          <w:rFonts w:ascii="Times New Roman" w:hAnsi="Times New Roman" w:cs="Times New Roman"/>
+          <w:sz w:val="24"/>
+          <w:szCs w:val="24"/>
+        </w:rPr>
+      </w:pPr>
+    </w:p>
+    <w:p>
+      <w:pPr>
+        <w:rPr>
+          <w:rFonts w:ascii="Times New Roman" w:hAnsi="Times New Roman" w:cs="Times New Roman"/>
+          <w:sz w:val="24"/>
+          <w:szCs w:val="24"/>
+        </w:rPr>
+      </w:pPr>
+    </w:p>
+    <w:p>
+      <w:pPr>
+        <w:rPr>
+          <w:rFonts w:ascii="Times New Roman" w:hAnsi="Times New Roman" w:cs="Times New Roman"/>
+          <w:sz w:val="24"/>
+          <w:szCs w:val="24"/>
+        </w:rPr>
+      </w:pPr>
+    </w:p>
+    <w:p>
+      <w:pPr>
+        <w:rPr>
+          <w:rFonts w:ascii="Times New Roman" w:hAnsi="Times New Roman" w:cs="Times New Roman"/>
+          <w:sz w:val="24"/>
+          <w:szCs w:val="24"/>
+        </w:rPr>
+      </w:pPr>
+    </w:p>
+    <w:p>
+      <w:pPr>
+        <w:rPr>
+          <w:rFonts w:ascii="Times New Roman" w:hAnsi="Times New Roman" w:cs="Times New Roman"/>
+          <w:sz w:val="24"/>
+          <w:szCs w:val="24"/>
+        </w:rPr>
+      </w:pPr>
+    </w:p>
+    <w:p>
+      <w:pPr>
+        <w:rPr>
+          <w:rFonts w:ascii="Times New Roman" w:hAnsi="Times New Roman" w:cs="Times New Roman"/>
+          <w:sz w:val="24"/>
+          <w:szCs w:val="24"/>
+        </w:rPr>
+      </w:pPr>
+    </w:p>
+    <w:p>
+      <w:pPr>
+        <w:rPr>
+          <w:rFonts w:ascii="Times New Roman" w:hAnsi="Times New Roman" w:cs="Times New Roman"/>
+          <w:sz w:val="24"/>
+          <w:szCs w:val="24"/>
+        </w:rPr>
+      </w:pPr>
+    </w:p>
+    <w:p>
+      <w:pPr>
+        <w:rPr>
+          <w:rFonts w:ascii="Times New Roman" w:hAnsi="Times New Roman" w:cs="Times New Roman"/>
+          <w:sz w:val="24"/>
+          <w:szCs w:val="24"/>
+        </w:rPr>
+      </w:pPr>
+    </w:p>
+    <w:p>
+      <w:pPr>
+        <w:rPr>
+          <w:rFonts w:ascii="Times New Roman" w:hAnsi="Times New Roman" w:cs="Times New Roman"/>
+          <w:sz w:val="24"/>
+          <w:szCs w:val="24"/>
+        </w:rPr>
+      </w:pPr>
+    </w:p>
+    <w:p>
+      <w:pPr>
+        <w:rPr>
+          <w:rFonts w:ascii="Times New Roman" w:hAnsi="Times New Roman" w:cs="Times New Roman"/>
+          <w:b/>
+          <w:bCs/>
+          <w:sz w:val="24"/>
+          <w:szCs w:val="24"/>
+          <w:u w:val="single"/>
+        </w:rPr>
+      </w:pPr>
+      <w:r>
+        <w:rPr>
+          <w:rFonts w:ascii="Times New Roman" w:hAnsi="Times New Roman" w:cs="Times New Roman"/>
+          <w:b/>
+          <w:bCs/>
+          <w:sz w:val="24"/>
+          <w:szCs w:val="24"/>
+          <w:u w:val="single"/>
+        </w:rPr>
+        <w:lastRenderedPageBreak/>
+        <w:t>5</w:t>
+      </w:r>
+      <w:r>
+        <w:rPr>
+          <w:rFonts w:ascii="Times New Roman" w:hAnsi="Times New Roman" w:cs="Times New Roman"/>
+          <w:b/>
+          <w:bCs/>
+          <w:sz w:val="24"/>
+          <w:szCs w:val="24"/>
+          <w:u w:val="single"/>
+        </w:rPr>
+        <w:t xml:space="preserve">. </w:t>
+      </w:r>
+      <w:r>
+        <w:rPr>
+          <w:rFonts w:ascii="Times New Roman" w:hAnsi="Times New Roman" w:cs="Times New Roman"/>
+          <w:b/>
+          <w:bCs/>
+          <w:sz w:val="24"/>
+          <w:szCs w:val="24"/>
+          <w:u w:val="single"/>
+        </w:rPr>
+        <w:t>pdf_to_grayscale</w:t>
+      </w:r>
+    </w:p>
+    <w:p>
+      <w:pPr>
+        <w:rPr>
+          <w:rFonts w:ascii="Times New Roman" w:hAnsi="Times New Roman" w:cs="Times New Roman"/>
+          <w:sz w:val="24"/>
+          <w:szCs w:val="24"/>
+        </w:rPr>
+      </w:pPr>
+      <w:r>
+        <w:rPr>
+          <w:rFonts w:ascii="Times New Roman" w:hAnsi="Times New Roman" w:cs="Times New Roman"/>
+          <w:sz w:val="24"/>
+          <w:szCs w:val="24"/>
+        </w:rPr>
+        <w:t>Windows:</w:t>
+      </w:r>
+      <w:r>
+        <w:rPr>
+          <w:rFonts w:ascii="Times New Roman" w:hAnsi="Times New Roman" w:cs="Times New Roman"/>
+          <w:sz w:val="24"/>
+          <w:szCs w:val="24"/>
+        </w:rPr>
+        <w:br/>
+      </w:r>
+      <w:r>
+        <w:rPr>
+          <w:rFonts w:ascii="Times New Roman" w:hAnsi="Times New Roman" w:cs="Times New Roman"/>
+          <w:sz w:val="24"/>
+          <w:szCs w:val="24"/>
+        </w:rPr>
+        <w:t>pyinstaller --onefile --name pdf_to_grayscale</w:t>
+      </w:r>
+      <w:r>
+        <w:rPr>
+          <w:rFonts w:ascii="Times New Roman" w:hAnsi="Times New Roman" w:cs="Times New Roman"/>
+          <w:sz w:val="24"/>
+          <w:szCs w:val="24"/>
+        </w:rPr>
+        <w:t xml:space="preserve"> </w:t>
+      </w:r>
+      <w:r>
+        <w:rPr>
+          <w:rFonts w:ascii="Times New Roman" w:hAnsi="Times New Roman" w:cs="Times New Roman"/>
+          <w:sz w:val="24"/>
+          <w:szCs w:val="24"/>
+        </w:rPr>
+        <w:t xml:space="preserve">--hidden-import=fitz --hidden-import=PyMuPDF </w:t>
+      </w:r>
+      <w:r>
+        <w:rPr>
+          <w:rFonts w:ascii="Times New Roman" w:hAnsi="Times New Roman" w:cs="Times New Roman"/>
+          <w:sz w:val="24"/>
+          <w:szCs w:val="24"/>
+        </w:rPr>
+        <w:t>-</w:t>
+      </w:r>
+      <w:r>
+        <w:rPr>
+          <w:rFonts w:ascii="Times New Roman" w:hAnsi="Times New Roman" w:cs="Times New Roman"/>
+          <w:sz w:val="24"/>
+          <w:szCs w:val="24"/>
+        </w:rPr>
+        <w:t>-collect-all fitz --collect-all PyMuPDF pdf_to_grayscale.py</w:t>
+      </w:r>
+    </w:p>
+    <w:p>
+      <w:pPr>
+        <w:rPr>
+          <w:rFonts w:ascii="Times New Roman" w:hAnsi="Times New Roman" w:cs="Times New Roman"/>
+          <w:sz w:val="24"/>
+          <w:szCs w:val="24"/>
+        </w:rPr>
+      </w:pPr>
+    </w:p>
+    <w:p>
+      <w:pPr>
+        <w:rPr>
+          <w:rFonts w:ascii="Times New Roman" w:hAnsi="Times New Roman" w:cs="Times New Roman"/>
+          <w:sz w:val="24"/>
+          <w:szCs w:val="24"/>
+        </w:rPr>
+      </w:pPr>
+      <w:r>
+        <w:rPr>
+          <w:rFonts w:ascii="Times New Roman" w:hAnsi="Times New Roman" w:cs="Times New Roman"/>
+          <w:sz w:val="24"/>
+          <w:szCs w:val="24"/>
+        </w:rPr>
+        <w:t>Linux:</w:t>
+      </w:r>
+    </w:p>
+    <w:p>
+      <w:pPr>
+        <w:rPr>
+          <w:rFonts w:ascii="Times New Roman" w:hAnsi="Times New Roman" w:cs="Times New Roman"/>
+          <w:sz w:val="24"/>
+          <w:szCs w:val="24"/>
+        </w:rPr>
+      </w:pPr>
+      <w:r>
+        <w:rPr>
+          <w:rFonts w:ascii="Times New Roman" w:hAnsi="Times New Roman" w:cs="Times New Roman"/>
+          <w:sz w:val="24"/>
+          <w:szCs w:val="24"/>
+        </w:rPr>
+        <w:t>pyinstaller --onefile --name pdf_to_grayscale</w:t>
+      </w:r>
+      <w:r>
+        <w:rPr>
+          <w:rFonts w:ascii="Times New Roman" w:hAnsi="Times New Roman" w:cs="Times New Roman"/>
+          <w:sz w:val="24"/>
+          <w:szCs w:val="24"/>
+        </w:rPr>
+        <w:t xml:space="preserve"> </w:t>
+      </w:r>
+      <w:r>
+        <w:rPr>
+          <w:rFonts w:ascii="Times New Roman" w:hAnsi="Times New Roman" w:cs="Times New Roman"/>
+          <w:sz w:val="24"/>
+          <w:szCs w:val="24"/>
+        </w:rPr>
+        <w:t xml:space="preserve">--hidden-import=fitz --hidden-import=PyMuPDF </w:t>
+      </w:r>
+      <w:r>
+        <w:rPr>
+          <w:rFonts w:ascii="Times New Roman" w:hAnsi="Times New Roman" w:cs="Times New Roman"/>
+          <w:sz w:val="24"/>
+          <w:szCs w:val="24"/>
+        </w:rPr>
+        <w:t>-</w:t>
+      </w:r>
+      <w:r>
+        <w:rPr>
+          <w:rFonts w:ascii="Times New Roman" w:hAnsi="Times New Roman" w:cs="Times New Roman"/>
+          <w:sz w:val="24"/>
+          <w:szCs w:val="24"/>
+        </w:rPr>
+        <w:t>-collect-all fitz --collect-all PyMuPDF pdf_to_grayscale.py</w:t>
+      </w:r>
+      <w:r>
+        <w:rPr>
+          <w:rFonts w:ascii="Times New Roman" w:hAnsi="Times New Roman" w:cs="Times New Roman"/>
+          <w:sz w:val="24"/>
+          <w:szCs w:val="24"/>
+        </w:rPr>
+        <w:t xml:space="preserve"> </w:t>
+      </w:r>
+    </w:p>
+    <w:p>
+      <w:pPr>
+        <w:rPr>
+          <w:rFonts w:ascii="Times New Roman" w:hAnsi="Times New Roman" w:cs="Times New Roman"/>
+          <w:sz w:val="24"/>
+          <w:szCs w:val="24"/>
+        </w:rPr>
+      </w:pPr>
+      <w:r>
+        <w:rPr>
+          <w:rFonts w:ascii="Times New Roman" w:hAnsi="Times New Roman" w:cs="Times New Roman"/>
+          <w:sz w:val="24"/>
+          <w:szCs w:val="24"/>
+        </w:rPr>
+        <w:t>chmod +x dist/</w:t>
+      </w:r>
+      <w:r>
+        <w:t xml:space="preserve"> </w:t>
+      </w:r>
+      <w:r>
+        <w:rPr>
+          <w:rFonts w:ascii="Times New Roman" w:hAnsi="Times New Roman" w:cs="Times New Roman"/>
+          <w:sz w:val="24"/>
+          <w:szCs w:val="24"/>
+        </w:rPr>
+        <w:t>pdf_to_grayscale</w:t>
+      </w:r>
+    </w:p>
+    <w:p>
+      <w:pPr>
+        <w:rPr>
+          <w:rFonts w:ascii="Times New Roman" w:hAnsi="Times New Roman" w:cs="Times New Roman"/>
+          <w:sz w:val="24"/>
+          <w:szCs w:val="24"/>
+        </w:rPr>
+      </w:pPr>
+    </w:p>
+    <w:p>
+      <w:pPr>
+        <w:rPr>
+          <w:rFonts w:ascii="Times New Roman" w:hAnsi="Times New Roman" w:cs="Times New Roman"/>
+          <w:sz w:val="24"/>
+          <w:szCs w:val="24"/>
+        </w:rPr>
+      </w:pPr>
+      <w:r>
+        <w:rPr>
+          <w:rFonts w:ascii="Times New Roman" w:hAnsi="Times New Roman" w:cs="Times New Roman"/>
+          <w:sz w:val="24"/>
+          <w:szCs w:val="24"/>
+        </w:rPr>
+        <w:t>macOS:</w:t>
+      </w:r>
+      <w:r>
+        <w:rPr>
+          <w:rFonts w:ascii="Times New Roman" w:hAnsi="Times New Roman" w:cs="Times New Roman"/>
+          <w:sz w:val="24"/>
+          <w:szCs w:val="24"/>
+        </w:rPr>
+        <w:br/>
+      </w:r>
+      <w:r>
+        <w:rPr>
+          <w:rFonts w:ascii="Times New Roman" w:hAnsi="Times New Roman" w:cs="Times New Roman"/>
+          <w:sz w:val="24"/>
+          <w:szCs w:val="24"/>
+        </w:rPr>
+        <w:t>pyinstaller --onefile --name pdf_to_grayscale</w:t>
+      </w:r>
+      <w:r>
+        <w:rPr>
+          <w:rFonts w:ascii="Times New Roman" w:hAnsi="Times New Roman" w:cs="Times New Roman"/>
+          <w:sz w:val="24"/>
+          <w:szCs w:val="24"/>
+        </w:rPr>
+        <w:t xml:space="preserve"> </w:t>
+      </w:r>
+      <w:r>
+        <w:rPr>
+          <w:rFonts w:ascii="Times New Roman" w:hAnsi="Times New Roman" w:cs="Times New Roman"/>
+          <w:sz w:val="24"/>
+          <w:szCs w:val="24"/>
+        </w:rPr>
+        <w:t xml:space="preserve">--hidden-import=fitz --hidden-import=PyMuPDF </w:t>
+      </w:r>
+      <w:r>
+        <w:rPr>
+          <w:rFonts w:ascii="Times New Roman" w:hAnsi="Times New Roman" w:cs="Times New Roman"/>
+          <w:sz w:val="24"/>
+          <w:szCs w:val="24"/>
+        </w:rPr>
+        <w:t>-</w:t>
+      </w:r>
+      <w:r>
+        <w:rPr>
+          <w:rFonts w:ascii="Times New Roman" w:hAnsi="Times New Roman" w:cs="Times New Roman"/>
+          <w:sz w:val="24"/>
+          <w:szCs w:val="24"/>
+        </w:rPr>
+        <w:t>-collect-all fitz --collect-all PyMuPDF pdf_to_grayscale.py</w:t>
+      </w:r>
+    </w:p>
+    <w:p>
+      <w:pPr>
+        <w:rPr>
+          <w:rFonts w:ascii="Times New Roman" w:hAnsi="Times New Roman" w:cs="Times New Roman"/>
+          <w:sz w:val="24"/>
+          <w:szCs w:val="24"/>
+        </w:rPr>
+      </w:pPr>
+      <w:r>
+        <w:rPr>
+          <w:rFonts w:ascii="Times New Roman" w:hAnsi="Times New Roman" w:cs="Times New Roman"/>
+          <w:sz w:val="24"/>
+          <w:szCs w:val="24"/>
+        </w:rPr>
+        <w:t>chmod +x dist/</w:t>
+      </w:r>
+      <w:r>
+        <w:t xml:space="preserve"> </w:t>
+      </w:r>
+      <w:r>
+        <w:rPr>
+          <w:rFonts w:ascii="Times New Roman" w:hAnsi="Times New Roman" w:cs="Times New Roman"/>
+          <w:sz w:val="24"/>
+          <w:szCs w:val="24"/>
+        </w:rPr>
+        <w:t>pdf_to_grayscale</w:t>
+      </w:r>
+    </w:p>
+    <w:p>
+      <w:pPr>
+        <w:rPr>
+          <w:rFonts w:ascii="Times New Roman" w:hAnsi="Times New Roman" w:cs="Times New Roman"/>
+          <w:sz w:val="24"/>
+          <w:szCs w:val="24"/>
+        </w:rPr>
+      </w:pPr>
     </w:p>
     <w:sectPr>
       <w:pgSz w:w="12240" w:h="15840"/>

</xml_diff>